<commit_message>
additional dev tools info added
</commit_message>
<xml_diff>
--- a/Java_Backend_Roadmap.docx
+++ b/Java_Backend_Roadmap.docx
@@ -23,7 +23,18 @@
           <w:szCs w:val="28"/>
           <w:u w:val="single"/>
         </w:rPr>
-        <w:t>Overview Java Backend</w:t>
+        <w:t>Roadmap</w:t>
+      </w:r>
+      <w:r>
+        <w:rPr>
+          <w:b/>
+          <w:bCs/>
+          <w:color w:val="FF0000"/>
+          <w:sz w:val="28"/>
+          <w:szCs w:val="28"/>
+          <w:u w:val="single"/>
+        </w:rPr>
+        <w:t xml:space="preserve"> Java Backend</w:t>
       </w:r>
     </w:p>
     <w:p>
@@ -2218,6 +2229,1418 @@
         </w:rPr>
         <w:t xml:space="preserve"> For coding style checks.</w:t>
       </w:r>
+    </w:p>
+    <w:p>
+      <w:pPr>
+        <w:rPr>
+          <w:sz w:val="28"/>
+          <w:szCs w:val="28"/>
+        </w:rPr>
+      </w:pPr>
+    </w:p>
+    <w:p>
+      <w:pPr>
+        <w:rPr>
+          <w:sz w:val="28"/>
+          <w:szCs w:val="28"/>
+        </w:rPr>
+      </w:pPr>
+    </w:p>
+    <w:p>
+      <w:pPr>
+        <w:jc w:val="center"/>
+        <w:rPr>
+          <w:b/>
+          <w:bCs/>
+          <w:color w:val="FF0000"/>
+          <w:sz w:val="28"/>
+          <w:szCs w:val="28"/>
+          <w:u w:val="single"/>
+        </w:rPr>
+      </w:pPr>
+      <w:r>
+        <w:rPr>
+          <w:b/>
+          <w:bCs/>
+          <w:color w:val="FF0000"/>
+          <w:sz w:val="28"/>
+          <w:szCs w:val="28"/>
+          <w:u w:val="single"/>
+        </w:rPr>
+        <w:lastRenderedPageBreak/>
+        <w:t>Additional Tools</w:t>
+      </w:r>
+    </w:p>
+    <w:p>
+      <w:pPr>
+        <w:rPr>
+          <w:b/>
+          <w:bCs/>
+          <w:color w:val="000000" w:themeColor="text1"/>
+          <w:sz w:val="28"/>
+          <w:szCs w:val="28"/>
+        </w:rPr>
+      </w:pPr>
+      <w:r>
+        <w:rPr>
+          <w:b/>
+          <w:bCs/>
+          <w:color w:val="000000" w:themeColor="text1"/>
+          <w:sz w:val="28"/>
+          <w:szCs w:val="28"/>
+        </w:rPr>
+        <w:t>**1. API Management</w:t>
+      </w:r>
+    </w:p>
+    <w:p>
+      <w:pPr>
+        <w:numPr>
+          <w:ilvl w:val="0"/>
+          <w:numId w:val="21"/>
+        </w:numPr>
+        <w:rPr>
+          <w:color w:val="000000" w:themeColor="text1"/>
+          <w:sz w:val="28"/>
+          <w:szCs w:val="28"/>
+        </w:rPr>
+      </w:pPr>
+      <w:r>
+        <w:rPr>
+          <w:b/>
+          <w:bCs/>
+          <w:color w:val="000000" w:themeColor="text1"/>
+          <w:sz w:val="28"/>
+          <w:szCs w:val="28"/>
+        </w:rPr>
+        <w:t>Apigee:</w:t>
+      </w:r>
+      <w:r>
+        <w:rPr>
+          <w:color w:val="000000" w:themeColor="text1"/>
+          <w:sz w:val="28"/>
+          <w:szCs w:val="28"/>
+        </w:rPr>
+        <w:t xml:space="preserve"> For managing and securing APIs.</w:t>
+      </w:r>
+    </w:p>
+    <w:p>
+      <w:pPr>
+        <w:numPr>
+          <w:ilvl w:val="0"/>
+          <w:numId w:val="21"/>
+        </w:numPr>
+        <w:rPr>
+          <w:color w:val="000000" w:themeColor="text1"/>
+          <w:sz w:val="28"/>
+          <w:szCs w:val="28"/>
+        </w:rPr>
+      </w:pPr>
+      <w:r>
+        <w:rPr>
+          <w:b/>
+          <w:bCs/>
+          <w:color w:val="000000" w:themeColor="text1"/>
+          <w:sz w:val="28"/>
+          <w:szCs w:val="28"/>
+        </w:rPr>
+        <w:t>Kong:</w:t>
+      </w:r>
+      <w:r>
+        <w:rPr>
+          <w:color w:val="000000" w:themeColor="text1"/>
+          <w:sz w:val="28"/>
+          <w:szCs w:val="28"/>
+        </w:rPr>
+        <w:t xml:space="preserve"> An open-source API gateway and management tool.</w:t>
+      </w:r>
+    </w:p>
+    <w:p>
+      <w:pPr>
+        <w:rPr>
+          <w:b/>
+          <w:bCs/>
+          <w:color w:val="000000" w:themeColor="text1"/>
+          <w:sz w:val="28"/>
+          <w:szCs w:val="28"/>
+        </w:rPr>
+      </w:pPr>
+      <w:r>
+        <w:rPr>
+          <w:b/>
+          <w:bCs/>
+          <w:color w:val="000000" w:themeColor="text1"/>
+          <w:sz w:val="28"/>
+          <w:szCs w:val="28"/>
+        </w:rPr>
+        <w:t>**2. Data Serialization Formats</w:t>
+      </w:r>
+    </w:p>
+    <w:p>
+      <w:pPr>
+        <w:numPr>
+          <w:ilvl w:val="0"/>
+          <w:numId w:val="22"/>
+        </w:numPr>
+        <w:rPr>
+          <w:color w:val="000000" w:themeColor="text1"/>
+          <w:sz w:val="28"/>
+          <w:szCs w:val="28"/>
+        </w:rPr>
+      </w:pPr>
+      <w:r>
+        <w:rPr>
+          <w:b/>
+          <w:bCs/>
+          <w:color w:val="000000" w:themeColor="text1"/>
+          <w:sz w:val="28"/>
+          <w:szCs w:val="28"/>
+        </w:rPr>
+        <w:t>Jackson/Gson:</w:t>
+      </w:r>
+      <w:r>
+        <w:rPr>
+          <w:color w:val="000000" w:themeColor="text1"/>
+          <w:sz w:val="28"/>
+          <w:szCs w:val="28"/>
+        </w:rPr>
+        <w:t xml:space="preserve"> For converting Java objects to/from JSON.</w:t>
+      </w:r>
+    </w:p>
+    <w:p>
+      <w:pPr>
+        <w:numPr>
+          <w:ilvl w:val="0"/>
+          <w:numId w:val="22"/>
+        </w:numPr>
+        <w:rPr>
+          <w:color w:val="000000" w:themeColor="text1"/>
+          <w:sz w:val="28"/>
+          <w:szCs w:val="28"/>
+        </w:rPr>
+      </w:pPr>
+      <w:r>
+        <w:rPr>
+          <w:b/>
+          <w:bCs/>
+          <w:color w:val="000000" w:themeColor="text1"/>
+          <w:sz w:val="28"/>
+          <w:szCs w:val="28"/>
+        </w:rPr>
+        <w:t>Protobuf:</w:t>
+      </w:r>
+      <w:r>
+        <w:rPr>
+          <w:color w:val="000000" w:themeColor="text1"/>
+          <w:sz w:val="28"/>
+          <w:szCs w:val="28"/>
+        </w:rPr>
+        <w:t xml:space="preserve"> Google's language-neutral, platform-neutral, extensible mechanism for serializing structured data.</w:t>
+      </w:r>
+    </w:p>
+    <w:p>
+      <w:pPr>
+        <w:rPr>
+          <w:b/>
+          <w:bCs/>
+          <w:color w:val="000000" w:themeColor="text1"/>
+          <w:sz w:val="28"/>
+          <w:szCs w:val="28"/>
+        </w:rPr>
+      </w:pPr>
+      <w:r>
+        <w:rPr>
+          <w:b/>
+          <w:bCs/>
+          <w:color w:val="000000" w:themeColor="text1"/>
+          <w:sz w:val="28"/>
+          <w:szCs w:val="28"/>
+        </w:rPr>
+        <w:t>**3. Configuration Management</w:t>
+      </w:r>
+    </w:p>
+    <w:p>
+      <w:pPr>
+        <w:numPr>
+          <w:ilvl w:val="0"/>
+          <w:numId w:val="23"/>
+        </w:numPr>
+        <w:rPr>
+          <w:color w:val="000000" w:themeColor="text1"/>
+          <w:sz w:val="28"/>
+          <w:szCs w:val="28"/>
+        </w:rPr>
+      </w:pPr>
+      <w:r>
+        <w:rPr>
+          <w:b/>
+          <w:bCs/>
+          <w:color w:val="000000" w:themeColor="text1"/>
+          <w:sz w:val="28"/>
+          <w:szCs w:val="28"/>
+        </w:rPr>
+        <w:t>Spring Cloud Config:</w:t>
+      </w:r>
+      <w:r>
+        <w:rPr>
+          <w:color w:val="000000" w:themeColor="text1"/>
+          <w:sz w:val="28"/>
+          <w:szCs w:val="28"/>
+        </w:rPr>
+        <w:t xml:space="preserve"> For managing configuration in a distributed system.</w:t>
+      </w:r>
+    </w:p>
+    <w:p>
+      <w:pPr>
+        <w:numPr>
+          <w:ilvl w:val="0"/>
+          <w:numId w:val="23"/>
+        </w:numPr>
+        <w:rPr>
+          <w:color w:val="000000" w:themeColor="text1"/>
+          <w:sz w:val="28"/>
+          <w:szCs w:val="28"/>
+        </w:rPr>
+      </w:pPr>
+      <w:r>
+        <w:rPr>
+          <w:b/>
+          <w:bCs/>
+          <w:color w:val="000000" w:themeColor="text1"/>
+          <w:sz w:val="28"/>
+          <w:szCs w:val="28"/>
+        </w:rPr>
+        <w:t>Consul/Etcd:</w:t>
+      </w:r>
+      <w:r>
+        <w:rPr>
+          <w:color w:val="000000" w:themeColor="text1"/>
+          <w:sz w:val="28"/>
+          <w:szCs w:val="28"/>
+        </w:rPr>
+        <w:t xml:space="preserve"> For service discovery and configuration management.</w:t>
+      </w:r>
+    </w:p>
+    <w:p>
+      <w:pPr>
+        <w:rPr>
+          <w:b/>
+          <w:bCs/>
+          <w:color w:val="000000" w:themeColor="text1"/>
+          <w:sz w:val="28"/>
+          <w:szCs w:val="28"/>
+        </w:rPr>
+      </w:pPr>
+      <w:r>
+        <w:rPr>
+          <w:b/>
+          <w:bCs/>
+          <w:color w:val="000000" w:themeColor="text1"/>
+          <w:sz w:val="28"/>
+          <w:szCs w:val="28"/>
+        </w:rPr>
+        <w:t>**4. Service Discovery</w:t>
+      </w:r>
+    </w:p>
+    <w:p>
+      <w:pPr>
+        <w:numPr>
+          <w:ilvl w:val="0"/>
+          <w:numId w:val="24"/>
+        </w:numPr>
+        <w:rPr>
+          <w:color w:val="000000" w:themeColor="text1"/>
+          <w:sz w:val="28"/>
+          <w:szCs w:val="28"/>
+        </w:rPr>
+      </w:pPr>
+      <w:r>
+        <w:rPr>
+          <w:b/>
+          <w:bCs/>
+          <w:color w:val="000000" w:themeColor="text1"/>
+          <w:sz w:val="28"/>
+          <w:szCs w:val="28"/>
+        </w:rPr>
+        <w:t>Eureka:</w:t>
+      </w:r>
+      <w:r>
+        <w:rPr>
+          <w:color w:val="000000" w:themeColor="text1"/>
+          <w:sz w:val="28"/>
+          <w:szCs w:val="28"/>
+        </w:rPr>
+        <w:t xml:space="preserve"> A REST-based service for locating services for the purpose of load balancing and failover of middle-tier servers.</w:t>
+      </w:r>
+    </w:p>
+    <w:p>
+      <w:pPr>
+        <w:numPr>
+          <w:ilvl w:val="0"/>
+          <w:numId w:val="24"/>
+        </w:numPr>
+        <w:rPr>
+          <w:color w:val="000000" w:themeColor="text1"/>
+          <w:sz w:val="28"/>
+          <w:szCs w:val="28"/>
+        </w:rPr>
+      </w:pPr>
+      <w:r>
+        <w:rPr>
+          <w:b/>
+          <w:bCs/>
+          <w:color w:val="000000" w:themeColor="text1"/>
+          <w:sz w:val="28"/>
+          <w:szCs w:val="28"/>
+        </w:rPr>
+        <w:t>Consul:</w:t>
+      </w:r>
+      <w:r>
+        <w:rPr>
+          <w:color w:val="000000" w:themeColor="text1"/>
+          <w:sz w:val="28"/>
+          <w:szCs w:val="28"/>
+        </w:rPr>
+        <w:t xml:space="preserve"> For service discovery and configuration.</w:t>
+      </w:r>
+    </w:p>
+    <w:p>
+      <w:pPr>
+        <w:rPr>
+          <w:b/>
+          <w:bCs/>
+          <w:color w:val="000000" w:themeColor="text1"/>
+          <w:sz w:val="28"/>
+          <w:szCs w:val="28"/>
+        </w:rPr>
+      </w:pPr>
+      <w:r>
+        <w:rPr>
+          <w:b/>
+          <w:bCs/>
+          <w:color w:val="000000" w:themeColor="text1"/>
+          <w:sz w:val="28"/>
+          <w:szCs w:val="28"/>
+        </w:rPr>
+        <w:t>**5. Networking and Communication</w:t>
+      </w:r>
+    </w:p>
+    <w:p>
+      <w:pPr>
+        <w:numPr>
+          <w:ilvl w:val="0"/>
+          <w:numId w:val="25"/>
+        </w:numPr>
+        <w:rPr>
+          <w:color w:val="000000" w:themeColor="text1"/>
+          <w:sz w:val="28"/>
+          <w:szCs w:val="28"/>
+        </w:rPr>
+      </w:pPr>
+      <w:r>
+        <w:rPr>
+          <w:b/>
+          <w:bCs/>
+          <w:color w:val="000000" w:themeColor="text1"/>
+          <w:sz w:val="28"/>
+          <w:szCs w:val="28"/>
+        </w:rPr>
+        <w:t>Netty:</w:t>
+      </w:r>
+      <w:r>
+        <w:rPr>
+          <w:color w:val="000000" w:themeColor="text1"/>
+          <w:sz w:val="28"/>
+          <w:szCs w:val="28"/>
+        </w:rPr>
+        <w:t xml:space="preserve"> A non-blocking I/O client-server framework for rapid development of maintainable high-performance protocol servers &amp; clients.</w:t>
+      </w:r>
+    </w:p>
+    <w:p>
+      <w:pPr>
+        <w:numPr>
+          <w:ilvl w:val="0"/>
+          <w:numId w:val="25"/>
+        </w:numPr>
+        <w:rPr>
+          <w:color w:val="000000" w:themeColor="text1"/>
+          <w:sz w:val="28"/>
+          <w:szCs w:val="28"/>
+        </w:rPr>
+      </w:pPr>
+      <w:r>
+        <w:rPr>
+          <w:b/>
+          <w:bCs/>
+          <w:color w:val="000000" w:themeColor="text1"/>
+          <w:sz w:val="28"/>
+          <w:szCs w:val="28"/>
+        </w:rPr>
+        <w:t>Apache Thrift:</w:t>
+      </w:r>
+      <w:r>
+        <w:rPr>
+          <w:color w:val="000000" w:themeColor="text1"/>
+          <w:sz w:val="28"/>
+          <w:szCs w:val="28"/>
+        </w:rPr>
+        <w:t xml:space="preserve"> A software framework for scalable cross-language services development.</w:t>
+      </w:r>
+    </w:p>
+    <w:p>
+      <w:pPr>
+        <w:rPr>
+          <w:b/>
+          <w:bCs/>
+          <w:color w:val="000000" w:themeColor="text1"/>
+          <w:sz w:val="28"/>
+          <w:szCs w:val="28"/>
+        </w:rPr>
+      </w:pPr>
+      <w:r>
+        <w:rPr>
+          <w:b/>
+          <w:bCs/>
+          <w:color w:val="000000" w:themeColor="text1"/>
+          <w:sz w:val="28"/>
+          <w:szCs w:val="28"/>
+        </w:rPr>
+        <w:t>**6. Web Servers</w:t>
+      </w:r>
+    </w:p>
+    <w:p>
+      <w:pPr>
+        <w:numPr>
+          <w:ilvl w:val="0"/>
+          <w:numId w:val="26"/>
+        </w:numPr>
+        <w:rPr>
+          <w:color w:val="000000" w:themeColor="text1"/>
+          <w:sz w:val="28"/>
+          <w:szCs w:val="28"/>
+        </w:rPr>
+      </w:pPr>
+      <w:r>
+        <w:rPr>
+          <w:b/>
+          <w:bCs/>
+          <w:color w:val="000000" w:themeColor="text1"/>
+          <w:sz w:val="28"/>
+          <w:szCs w:val="28"/>
+        </w:rPr>
+        <w:t>Nginx/Apache HTTP Server:</w:t>
+      </w:r>
+      <w:r>
+        <w:rPr>
+          <w:color w:val="000000" w:themeColor="text1"/>
+          <w:sz w:val="28"/>
+          <w:szCs w:val="28"/>
+        </w:rPr>
+        <w:t xml:space="preserve"> For handling HTTP requests, load balancing, and serving static files.</w:t>
+      </w:r>
+    </w:p>
+    <w:p>
+      <w:pPr>
+        <w:rPr>
+          <w:b/>
+          <w:bCs/>
+          <w:color w:val="000000" w:themeColor="text1"/>
+          <w:sz w:val="28"/>
+          <w:szCs w:val="28"/>
+        </w:rPr>
+      </w:pPr>
+      <w:r>
+        <w:rPr>
+          <w:b/>
+          <w:bCs/>
+          <w:color w:val="000000" w:themeColor="text1"/>
+          <w:sz w:val="28"/>
+          <w:szCs w:val="28"/>
+        </w:rPr>
+        <w:t>**7. Job Scheduling</w:t>
+      </w:r>
+    </w:p>
+    <w:p>
+      <w:pPr>
+        <w:numPr>
+          <w:ilvl w:val="0"/>
+          <w:numId w:val="27"/>
+        </w:numPr>
+        <w:rPr>
+          <w:color w:val="000000" w:themeColor="text1"/>
+          <w:sz w:val="28"/>
+          <w:szCs w:val="28"/>
+        </w:rPr>
+      </w:pPr>
+      <w:r>
+        <w:rPr>
+          <w:b/>
+          <w:bCs/>
+          <w:color w:val="000000" w:themeColor="text1"/>
+          <w:sz w:val="28"/>
+          <w:szCs w:val="28"/>
+        </w:rPr>
+        <w:t>Quartz:</w:t>
+      </w:r>
+      <w:r>
+        <w:rPr>
+          <w:color w:val="000000" w:themeColor="text1"/>
+          <w:sz w:val="28"/>
+          <w:szCs w:val="28"/>
+        </w:rPr>
+        <w:t xml:space="preserve"> A full-featured, open-source job scheduling system.</w:t>
+      </w:r>
+    </w:p>
+    <w:p>
+      <w:pPr>
+        <w:numPr>
+          <w:ilvl w:val="0"/>
+          <w:numId w:val="27"/>
+        </w:numPr>
+        <w:rPr>
+          <w:color w:val="000000" w:themeColor="text1"/>
+          <w:sz w:val="28"/>
+          <w:szCs w:val="28"/>
+        </w:rPr>
+      </w:pPr>
+      <w:r>
+        <w:rPr>
+          <w:b/>
+          <w:bCs/>
+          <w:color w:val="000000" w:themeColor="text1"/>
+          <w:sz w:val="28"/>
+          <w:szCs w:val="28"/>
+        </w:rPr>
+        <w:t>Spring Batch:</w:t>
+      </w:r>
+      <w:r>
+        <w:rPr>
+          <w:color w:val="000000" w:themeColor="text1"/>
+          <w:sz w:val="28"/>
+          <w:szCs w:val="28"/>
+        </w:rPr>
+        <w:t xml:space="preserve"> For batch processing.</w:t>
+      </w:r>
+    </w:p>
+    <w:p>
+      <w:pPr>
+        <w:rPr>
+          <w:b/>
+          <w:bCs/>
+          <w:color w:val="000000" w:themeColor="text1"/>
+          <w:sz w:val="28"/>
+          <w:szCs w:val="28"/>
+        </w:rPr>
+      </w:pPr>
+      <w:r>
+        <w:rPr>
+          <w:b/>
+          <w:bCs/>
+          <w:color w:val="000000" w:themeColor="text1"/>
+          <w:sz w:val="28"/>
+          <w:szCs w:val="28"/>
+        </w:rPr>
+        <w:t>**8. Reactive Programming</w:t>
+      </w:r>
+    </w:p>
+    <w:p>
+      <w:pPr>
+        <w:numPr>
+          <w:ilvl w:val="0"/>
+          <w:numId w:val="28"/>
+        </w:numPr>
+        <w:rPr>
+          <w:color w:val="000000" w:themeColor="text1"/>
+          <w:sz w:val="28"/>
+          <w:szCs w:val="28"/>
+        </w:rPr>
+      </w:pPr>
+      <w:r>
+        <w:rPr>
+          <w:b/>
+          <w:bCs/>
+          <w:color w:val="000000" w:themeColor="text1"/>
+          <w:sz w:val="28"/>
+          <w:szCs w:val="28"/>
+        </w:rPr>
+        <w:t>Reactor:</w:t>
+      </w:r>
+      <w:r>
+        <w:rPr>
+          <w:color w:val="000000" w:themeColor="text1"/>
+          <w:sz w:val="28"/>
+          <w:szCs w:val="28"/>
+        </w:rPr>
+        <w:t xml:space="preserve"> A library for building reactive applications, part of the Spring ecosystem.</w:t>
+      </w:r>
+    </w:p>
+    <w:p>
+      <w:pPr>
+        <w:numPr>
+          <w:ilvl w:val="0"/>
+          <w:numId w:val="28"/>
+        </w:numPr>
+        <w:rPr>
+          <w:color w:val="000000" w:themeColor="text1"/>
+          <w:sz w:val="28"/>
+          <w:szCs w:val="28"/>
+        </w:rPr>
+      </w:pPr>
+      <w:r>
+        <w:rPr>
+          <w:b/>
+          <w:bCs/>
+          <w:color w:val="000000" w:themeColor="text1"/>
+          <w:sz w:val="28"/>
+          <w:szCs w:val="28"/>
+        </w:rPr>
+        <w:lastRenderedPageBreak/>
+        <w:t>RxJava:</w:t>
+      </w:r>
+      <w:r>
+        <w:rPr>
+          <w:color w:val="000000" w:themeColor="text1"/>
+          <w:sz w:val="28"/>
+          <w:szCs w:val="28"/>
+        </w:rPr>
+        <w:t xml:space="preserve"> A library for composing asynchronous and event-based programs using observable sequences.</w:t>
+      </w:r>
+    </w:p>
+    <w:p>
+      <w:pPr>
+        <w:rPr>
+          <w:b/>
+          <w:bCs/>
+          <w:color w:val="000000" w:themeColor="text1"/>
+          <w:sz w:val="28"/>
+          <w:szCs w:val="28"/>
+        </w:rPr>
+      </w:pPr>
+      <w:r>
+        <w:rPr>
+          <w:b/>
+          <w:bCs/>
+          <w:color w:val="000000" w:themeColor="text1"/>
+          <w:sz w:val="28"/>
+          <w:szCs w:val="28"/>
+        </w:rPr>
+        <w:t>**9. Cloud-Native Tools</w:t>
+      </w:r>
+    </w:p>
+    <w:p>
+      <w:pPr>
+        <w:numPr>
+          <w:ilvl w:val="0"/>
+          <w:numId w:val="29"/>
+        </w:numPr>
+        <w:rPr>
+          <w:color w:val="000000" w:themeColor="text1"/>
+          <w:sz w:val="28"/>
+          <w:szCs w:val="28"/>
+        </w:rPr>
+      </w:pPr>
+      <w:r>
+        <w:rPr>
+          <w:b/>
+          <w:bCs/>
+          <w:color w:val="000000" w:themeColor="text1"/>
+          <w:sz w:val="28"/>
+          <w:szCs w:val="28"/>
+        </w:rPr>
+        <w:t>Spring Boot Actuator:</w:t>
+      </w:r>
+      <w:r>
+        <w:rPr>
+          <w:color w:val="000000" w:themeColor="text1"/>
+          <w:sz w:val="28"/>
+          <w:szCs w:val="28"/>
+        </w:rPr>
+        <w:t xml:space="preserve"> For monitoring and managing Spring Boot applications.</w:t>
+      </w:r>
+    </w:p>
+    <w:p>
+      <w:pPr>
+        <w:numPr>
+          <w:ilvl w:val="0"/>
+          <w:numId w:val="29"/>
+        </w:numPr>
+        <w:rPr>
+          <w:color w:val="000000" w:themeColor="text1"/>
+          <w:sz w:val="28"/>
+          <w:szCs w:val="28"/>
+        </w:rPr>
+      </w:pPr>
+      <w:r>
+        <w:rPr>
+          <w:b/>
+          <w:bCs/>
+          <w:color w:val="000000" w:themeColor="text1"/>
+          <w:sz w:val="28"/>
+          <w:szCs w:val="28"/>
+        </w:rPr>
+        <w:t>Helm:</w:t>
+      </w:r>
+      <w:r>
+        <w:rPr>
+          <w:color w:val="000000" w:themeColor="text1"/>
+          <w:sz w:val="28"/>
+          <w:szCs w:val="28"/>
+        </w:rPr>
+        <w:t xml:space="preserve"> A package manager for Kubernetes, for managing Kubernetes applications.</w:t>
+      </w:r>
+    </w:p>
+    <w:p>
+      <w:pPr>
+        <w:rPr>
+          <w:b/>
+          <w:bCs/>
+          <w:color w:val="000000" w:themeColor="text1"/>
+          <w:sz w:val="28"/>
+          <w:szCs w:val="28"/>
+        </w:rPr>
+      </w:pPr>
+      <w:r>
+        <w:rPr>
+          <w:b/>
+          <w:bCs/>
+          <w:color w:val="000000" w:themeColor="text1"/>
+          <w:sz w:val="28"/>
+          <w:szCs w:val="28"/>
+        </w:rPr>
+        <w:t>**10. Graph Database</w:t>
+      </w:r>
+    </w:p>
+    <w:p>
+      <w:pPr>
+        <w:numPr>
+          <w:ilvl w:val="0"/>
+          <w:numId w:val="30"/>
+        </w:numPr>
+        <w:rPr>
+          <w:color w:val="000000" w:themeColor="text1"/>
+          <w:sz w:val="28"/>
+          <w:szCs w:val="28"/>
+        </w:rPr>
+      </w:pPr>
+      <w:r>
+        <w:rPr>
+          <w:b/>
+          <w:bCs/>
+          <w:color w:val="000000" w:themeColor="text1"/>
+          <w:sz w:val="28"/>
+          <w:szCs w:val="28"/>
+        </w:rPr>
+        <w:t>Neo4j:</w:t>
+      </w:r>
+      <w:r>
+        <w:rPr>
+          <w:color w:val="000000" w:themeColor="text1"/>
+          <w:sz w:val="28"/>
+          <w:szCs w:val="28"/>
+        </w:rPr>
+        <w:t xml:space="preserve"> A graph database for handling data with complex relationships.</w:t>
+      </w:r>
+    </w:p>
+    <w:p>
+      <w:pPr>
+        <w:rPr>
+          <w:b/>
+          <w:bCs/>
+          <w:color w:val="000000" w:themeColor="text1"/>
+          <w:sz w:val="28"/>
+          <w:szCs w:val="28"/>
+        </w:rPr>
+      </w:pPr>
+      <w:r>
+        <w:rPr>
+          <w:b/>
+          <w:bCs/>
+          <w:color w:val="000000" w:themeColor="text1"/>
+          <w:sz w:val="28"/>
+          <w:szCs w:val="28"/>
+        </w:rPr>
+        <w:t>**11. Documentation Tools</w:t>
+      </w:r>
+    </w:p>
+    <w:p>
+      <w:pPr>
+        <w:numPr>
+          <w:ilvl w:val="0"/>
+          <w:numId w:val="31"/>
+        </w:numPr>
+        <w:rPr>
+          <w:color w:val="000000" w:themeColor="text1"/>
+          <w:sz w:val="28"/>
+          <w:szCs w:val="28"/>
+        </w:rPr>
+      </w:pPr>
+      <w:r>
+        <w:rPr>
+          <w:b/>
+          <w:bCs/>
+          <w:color w:val="000000" w:themeColor="text1"/>
+          <w:sz w:val="28"/>
+          <w:szCs w:val="28"/>
+        </w:rPr>
+        <w:t>Asciidoc:</w:t>
+      </w:r>
+      <w:r>
+        <w:rPr>
+          <w:color w:val="000000" w:themeColor="text1"/>
+          <w:sz w:val="28"/>
+          <w:szCs w:val="28"/>
+        </w:rPr>
+        <w:t xml:space="preserve"> A text document format for writing documentation, and tools like Asciidoctor for converting it to HTML, PDF, etc.</w:t>
+      </w:r>
+    </w:p>
+    <w:p>
+      <w:pPr>
+        <w:numPr>
+          <w:ilvl w:val="0"/>
+          <w:numId w:val="31"/>
+        </w:numPr>
+        <w:rPr>
+          <w:color w:val="000000" w:themeColor="text1"/>
+          <w:sz w:val="28"/>
+          <w:szCs w:val="28"/>
+        </w:rPr>
+      </w:pPr>
+      <w:r>
+        <w:rPr>
+          <w:b/>
+          <w:bCs/>
+          <w:color w:val="000000" w:themeColor="text1"/>
+          <w:sz w:val="28"/>
+          <w:szCs w:val="28"/>
+        </w:rPr>
+        <w:t>MkDocs:</w:t>
+      </w:r>
+      <w:r>
+        <w:rPr>
+          <w:color w:val="000000" w:themeColor="text1"/>
+          <w:sz w:val="28"/>
+          <w:szCs w:val="28"/>
+        </w:rPr>
+        <w:t xml:space="preserve"> A static site generator that's geared towards project documentation.</w:t>
+      </w:r>
+    </w:p>
+    <w:p>
+      <w:pPr>
+        <w:rPr>
+          <w:b/>
+          <w:bCs/>
+          <w:color w:val="000000" w:themeColor="text1"/>
+          <w:sz w:val="28"/>
+          <w:szCs w:val="28"/>
+        </w:rPr>
+      </w:pPr>
+      <w:r>
+        <w:rPr>
+          <w:b/>
+          <w:bCs/>
+          <w:color w:val="000000" w:themeColor="text1"/>
+          <w:sz w:val="28"/>
+          <w:szCs w:val="28"/>
+        </w:rPr>
+        <w:t>**12. API Mocking</w:t>
+      </w:r>
+    </w:p>
+    <w:p>
+      <w:pPr>
+        <w:numPr>
+          <w:ilvl w:val="0"/>
+          <w:numId w:val="32"/>
+        </w:numPr>
+        <w:rPr>
+          <w:color w:val="000000" w:themeColor="text1"/>
+          <w:sz w:val="28"/>
+          <w:szCs w:val="28"/>
+        </w:rPr>
+      </w:pPr>
+      <w:r>
+        <w:rPr>
+          <w:b/>
+          <w:bCs/>
+          <w:color w:val="000000" w:themeColor="text1"/>
+          <w:sz w:val="28"/>
+          <w:szCs w:val="28"/>
+        </w:rPr>
+        <w:t>WireMock:</w:t>
+      </w:r>
+      <w:r>
+        <w:rPr>
+          <w:color w:val="000000" w:themeColor="text1"/>
+          <w:sz w:val="28"/>
+          <w:szCs w:val="28"/>
+        </w:rPr>
+        <w:t xml:space="preserve"> A tool for mocking and testing APIs.</w:t>
+      </w:r>
+    </w:p>
+    <w:p>
+      <w:pPr>
+        <w:numPr>
+          <w:ilvl w:val="0"/>
+          <w:numId w:val="32"/>
+        </w:numPr>
+        <w:rPr>
+          <w:color w:val="000000" w:themeColor="text1"/>
+          <w:sz w:val="28"/>
+          <w:szCs w:val="28"/>
+        </w:rPr>
+      </w:pPr>
+      <w:r>
+        <w:rPr>
+          <w:b/>
+          <w:bCs/>
+          <w:color w:val="000000" w:themeColor="text1"/>
+          <w:sz w:val="28"/>
+          <w:szCs w:val="28"/>
+        </w:rPr>
+        <w:t>MockServer:</w:t>
+      </w:r>
+      <w:r>
+        <w:rPr>
+          <w:color w:val="000000" w:themeColor="text1"/>
+          <w:sz w:val="28"/>
+          <w:szCs w:val="28"/>
+        </w:rPr>
+        <w:t xml:space="preserve"> For mocking and proxying HTTP and HTTPS requests.</w:t>
+      </w:r>
+    </w:p>
+    <w:p>
+      <w:pPr>
+        <w:rPr>
+          <w:b/>
+          <w:bCs/>
+          <w:color w:val="000000" w:themeColor="text1"/>
+          <w:sz w:val="28"/>
+          <w:szCs w:val="28"/>
+        </w:rPr>
+      </w:pPr>
+      <w:r>
+        <w:rPr>
+          <w:b/>
+          <w:bCs/>
+          <w:color w:val="000000" w:themeColor="text1"/>
+          <w:sz w:val="28"/>
+          <w:szCs w:val="28"/>
+        </w:rPr>
+        <w:t>**13. Feature Flags</w:t>
+      </w:r>
+    </w:p>
+    <w:p>
+      <w:pPr>
+        <w:numPr>
+          <w:ilvl w:val="0"/>
+          <w:numId w:val="33"/>
+        </w:numPr>
+        <w:rPr>
+          <w:color w:val="000000" w:themeColor="text1"/>
+          <w:sz w:val="28"/>
+          <w:szCs w:val="28"/>
+        </w:rPr>
+      </w:pPr>
+      <w:r>
+        <w:rPr>
+          <w:b/>
+          <w:bCs/>
+          <w:color w:val="000000" w:themeColor="text1"/>
+          <w:sz w:val="28"/>
+          <w:szCs w:val="28"/>
+        </w:rPr>
+        <w:t>LaunchDarkly:</w:t>
+      </w:r>
+      <w:r>
+        <w:rPr>
+          <w:color w:val="000000" w:themeColor="text1"/>
+          <w:sz w:val="28"/>
+          <w:szCs w:val="28"/>
+        </w:rPr>
+        <w:t xml:space="preserve"> A feature management platform for deploying and controlling feature flags.</w:t>
+      </w:r>
+    </w:p>
+    <w:p>
+      <w:pPr>
+        <w:rPr>
+          <w:b/>
+          <w:bCs/>
+          <w:color w:val="000000" w:themeColor="text1"/>
+          <w:sz w:val="28"/>
+          <w:szCs w:val="28"/>
+        </w:rPr>
+      </w:pPr>
+      <w:r>
+        <w:rPr>
+          <w:b/>
+          <w:bCs/>
+          <w:color w:val="000000" w:themeColor="text1"/>
+          <w:sz w:val="28"/>
+          <w:szCs w:val="28"/>
+        </w:rPr>
+        <w:t>**14. Code Quality and Security Analysis</w:t>
+      </w:r>
+    </w:p>
+    <w:p>
+      <w:pPr>
+        <w:numPr>
+          <w:ilvl w:val="0"/>
+          <w:numId w:val="34"/>
+        </w:numPr>
+        <w:rPr>
+          <w:color w:val="000000" w:themeColor="text1"/>
+          <w:sz w:val="28"/>
+          <w:szCs w:val="28"/>
+        </w:rPr>
+      </w:pPr>
+      <w:r>
+        <w:rPr>
+          <w:b/>
+          <w:bCs/>
+          <w:color w:val="000000" w:themeColor="text1"/>
+          <w:sz w:val="28"/>
+          <w:szCs w:val="28"/>
+        </w:rPr>
+        <w:t>FindBugs/SpotBugs:</w:t>
+      </w:r>
+      <w:r>
+        <w:rPr>
+          <w:color w:val="000000" w:themeColor="text1"/>
+          <w:sz w:val="28"/>
+          <w:szCs w:val="28"/>
+        </w:rPr>
+        <w:t xml:space="preserve"> For static analysis to find bugs.</w:t>
+      </w:r>
+    </w:p>
+    <w:p>
+      <w:pPr>
+        <w:numPr>
+          <w:ilvl w:val="0"/>
+          <w:numId w:val="34"/>
+        </w:numPr>
+        <w:rPr>
+          <w:color w:val="000000" w:themeColor="text1"/>
+          <w:sz w:val="28"/>
+          <w:szCs w:val="28"/>
+        </w:rPr>
+      </w:pPr>
+      <w:r>
+        <w:rPr>
+          <w:b/>
+          <w:bCs/>
+          <w:color w:val="000000" w:themeColor="text1"/>
+          <w:sz w:val="28"/>
+          <w:szCs w:val="28"/>
+        </w:rPr>
+        <w:t>Snyk:</w:t>
+      </w:r>
+      <w:r>
+        <w:rPr>
+          <w:color w:val="000000" w:themeColor="text1"/>
+          <w:sz w:val="28"/>
+          <w:szCs w:val="28"/>
+        </w:rPr>
+        <w:t xml:space="preserve"> For identifying vulnerabilities in dependencies.</w:t>
+      </w:r>
+    </w:p>
+    <w:p>
+      <w:pPr>
+        <w:rPr>
+          <w:b/>
+          <w:bCs/>
+          <w:color w:val="000000" w:themeColor="text1"/>
+          <w:sz w:val="28"/>
+          <w:szCs w:val="28"/>
+        </w:rPr>
+      </w:pPr>
+      <w:r>
+        <w:rPr>
+          <w:b/>
+          <w:bCs/>
+          <w:color w:val="000000" w:themeColor="text1"/>
+          <w:sz w:val="28"/>
+          <w:szCs w:val="28"/>
+        </w:rPr>
+        <w:t>**15. Container Orchestration</w:t>
+      </w:r>
+    </w:p>
+    <w:p>
+      <w:pPr>
+        <w:numPr>
+          <w:ilvl w:val="0"/>
+          <w:numId w:val="35"/>
+        </w:numPr>
+        <w:rPr>
+          <w:color w:val="000000" w:themeColor="text1"/>
+          <w:sz w:val="28"/>
+          <w:szCs w:val="28"/>
+        </w:rPr>
+      </w:pPr>
+      <w:r>
+        <w:rPr>
+          <w:b/>
+          <w:bCs/>
+          <w:color w:val="000000" w:themeColor="text1"/>
+          <w:sz w:val="28"/>
+          <w:szCs w:val="28"/>
+        </w:rPr>
+        <w:t>Docker Compose:</w:t>
+      </w:r>
+      <w:r>
+        <w:rPr>
+          <w:color w:val="000000" w:themeColor="text1"/>
+          <w:sz w:val="28"/>
+          <w:szCs w:val="28"/>
+        </w:rPr>
+        <w:t xml:space="preserve"> For defining and running multi-container Docker applications.</w:t>
+      </w:r>
+    </w:p>
+    <w:p>
+      <w:pPr>
+        <w:rPr>
+          <w:b/>
+          <w:bCs/>
+          <w:color w:val="000000" w:themeColor="text1"/>
+          <w:sz w:val="28"/>
+          <w:szCs w:val="28"/>
+        </w:rPr>
+      </w:pPr>
+      <w:r>
+        <w:rPr>
+          <w:b/>
+          <w:bCs/>
+          <w:color w:val="000000" w:themeColor="text1"/>
+          <w:sz w:val="28"/>
+          <w:szCs w:val="28"/>
+        </w:rPr>
+        <w:t>**16. Event Sourcing and CQRS</w:t>
+      </w:r>
+    </w:p>
+    <w:p>
+      <w:pPr>
+        <w:numPr>
+          <w:ilvl w:val="0"/>
+          <w:numId w:val="36"/>
+        </w:numPr>
+        <w:rPr>
+          <w:color w:val="000000" w:themeColor="text1"/>
+          <w:sz w:val="28"/>
+          <w:szCs w:val="28"/>
+        </w:rPr>
+      </w:pPr>
+      <w:r>
+        <w:rPr>
+          <w:b/>
+          <w:bCs/>
+          <w:color w:val="000000" w:themeColor="text1"/>
+          <w:sz w:val="28"/>
+          <w:szCs w:val="28"/>
+        </w:rPr>
+        <w:t>EventStore:</w:t>
+      </w:r>
+      <w:r>
+        <w:rPr>
+          <w:color w:val="000000" w:themeColor="text1"/>
+          <w:sz w:val="28"/>
+          <w:szCs w:val="28"/>
+        </w:rPr>
+        <w:t xml:space="preserve"> A database designed for event sourcing.</w:t>
+      </w:r>
+    </w:p>
+    <w:p>
+      <w:pPr>
+        <w:numPr>
+          <w:ilvl w:val="0"/>
+          <w:numId w:val="36"/>
+        </w:numPr>
+        <w:rPr>
+          <w:color w:val="000000" w:themeColor="text1"/>
+          <w:sz w:val="28"/>
+          <w:szCs w:val="28"/>
+        </w:rPr>
+      </w:pPr>
+      <w:r>
+        <w:rPr>
+          <w:b/>
+          <w:bCs/>
+          <w:color w:val="000000" w:themeColor="text1"/>
+          <w:sz w:val="28"/>
+          <w:szCs w:val="28"/>
+        </w:rPr>
+        <w:t>Axon Framework:</w:t>
+      </w:r>
+      <w:r>
+        <w:rPr>
+          <w:color w:val="000000" w:themeColor="text1"/>
+          <w:sz w:val="28"/>
+          <w:szCs w:val="28"/>
+        </w:rPr>
+        <w:t xml:space="preserve"> Provides infrastructure support for CQRS and Event Sourcing.</w:t>
+      </w:r>
+    </w:p>
+    <w:p>
+      <w:pPr>
+        <w:rPr>
+          <w:b/>
+          <w:bCs/>
+          <w:color w:val="000000" w:themeColor="text1"/>
+          <w:sz w:val="28"/>
+          <w:szCs w:val="28"/>
+        </w:rPr>
+      </w:pPr>
+      <w:r>
+        <w:rPr>
+          <w:b/>
+          <w:bCs/>
+          <w:color w:val="000000" w:themeColor="text1"/>
+          <w:sz w:val="28"/>
+          <w:szCs w:val="28"/>
+        </w:rPr>
+        <w:t>**17. Design Patterns and Principles</w:t>
+      </w:r>
+    </w:p>
+    <w:p>
+      <w:pPr>
+        <w:numPr>
+          <w:ilvl w:val="0"/>
+          <w:numId w:val="37"/>
+        </w:numPr>
+        <w:rPr>
+          <w:color w:val="000000" w:themeColor="text1"/>
+          <w:sz w:val="28"/>
+          <w:szCs w:val="28"/>
+        </w:rPr>
+      </w:pPr>
+      <w:r>
+        <w:rPr>
+          <w:b/>
+          <w:bCs/>
+          <w:color w:val="000000" w:themeColor="text1"/>
+          <w:sz w:val="28"/>
+          <w:szCs w:val="28"/>
+        </w:rPr>
+        <w:t>Gang of Four (GoF) Patterns:</w:t>
+      </w:r>
+      <w:r>
+        <w:rPr>
+          <w:color w:val="000000" w:themeColor="text1"/>
+          <w:sz w:val="28"/>
+          <w:szCs w:val="28"/>
+        </w:rPr>
+        <w:t xml:space="preserve"> Familiarize yourself with common design patterns to write scalable and maintainable code.</w:t>
+      </w:r>
+    </w:p>
+    <w:p>
+      <w:pPr>
+        <w:rPr>
+          <w:b/>
+          <w:bCs/>
+          <w:color w:val="000000" w:themeColor="text1"/>
+          <w:sz w:val="28"/>
+          <w:szCs w:val="28"/>
+        </w:rPr>
+      </w:pPr>
+      <w:r>
+        <w:rPr>
+          <w:b/>
+          <w:bCs/>
+          <w:color w:val="000000" w:themeColor="text1"/>
+          <w:sz w:val="28"/>
+          <w:szCs w:val="28"/>
+        </w:rPr>
+        <w:lastRenderedPageBreak/>
+        <w:t>**18. Performance Testing</w:t>
+      </w:r>
+    </w:p>
+    <w:p>
+      <w:pPr>
+        <w:numPr>
+          <w:ilvl w:val="0"/>
+          <w:numId w:val="38"/>
+        </w:numPr>
+        <w:rPr>
+          <w:color w:val="000000" w:themeColor="text1"/>
+          <w:sz w:val="28"/>
+          <w:szCs w:val="28"/>
+        </w:rPr>
+      </w:pPr>
+      <w:r>
+        <w:rPr>
+          <w:b/>
+          <w:bCs/>
+          <w:color w:val="000000" w:themeColor="text1"/>
+          <w:sz w:val="28"/>
+          <w:szCs w:val="28"/>
+        </w:rPr>
+        <w:t>JMeter:</w:t>
+      </w:r>
+      <w:r>
+        <w:rPr>
+          <w:color w:val="000000" w:themeColor="text1"/>
+          <w:sz w:val="28"/>
+          <w:szCs w:val="28"/>
+        </w:rPr>
+        <w:t xml:space="preserve"> For performance and load testing of your application.</w:t>
+      </w:r>
+    </w:p>
+    <w:p>
+      <w:pPr>
+        <w:rPr>
+          <w:b/>
+          <w:bCs/>
+          <w:color w:val="000000" w:themeColor="text1"/>
+          <w:sz w:val="28"/>
+          <w:szCs w:val="28"/>
+        </w:rPr>
+      </w:pPr>
+      <w:r>
+        <w:rPr>
+          <w:b/>
+          <w:bCs/>
+          <w:color w:val="000000" w:themeColor="text1"/>
+          <w:sz w:val="28"/>
+          <w:szCs w:val="28"/>
+        </w:rPr>
+        <w:t>**19. API Rate Limiting</w:t>
+      </w:r>
+    </w:p>
+    <w:p>
+      <w:pPr>
+        <w:numPr>
+          <w:ilvl w:val="0"/>
+          <w:numId w:val="39"/>
+        </w:numPr>
+        <w:rPr>
+          <w:color w:val="000000" w:themeColor="text1"/>
+          <w:sz w:val="28"/>
+          <w:szCs w:val="28"/>
+        </w:rPr>
+      </w:pPr>
+      <w:r>
+        <w:rPr>
+          <w:b/>
+          <w:bCs/>
+          <w:color w:val="000000" w:themeColor="text1"/>
+          <w:sz w:val="28"/>
+          <w:szCs w:val="28"/>
+        </w:rPr>
+        <w:t>Bucket4j:</w:t>
+      </w:r>
+      <w:r>
+        <w:rPr>
+          <w:color w:val="000000" w:themeColor="text1"/>
+          <w:sz w:val="28"/>
+          <w:szCs w:val="28"/>
+        </w:rPr>
+        <w:t xml:space="preserve"> A Java library for rate limiting.</w:t>
+      </w:r>
+    </w:p>
+    <w:p>
+      <w:pPr>
+        <w:rPr>
+          <w:color w:val="000000" w:themeColor="text1"/>
+          <w:sz w:val="28"/>
+          <w:szCs w:val="28"/>
+        </w:rPr>
+      </w:pPr>
     </w:p>
     <w:sectPr>
       <w:pgSz w:w="12240" w:h="15840"/>
@@ -2232,6 +3655,1049 @@
 <file path=word/numbering.xml><?xml version="1.0" encoding="utf-8"?>
 <w:numbering xmlns:wpc="http://schemas.microsoft.com/office/word/2010/wordprocessingCanvas" xmlns:cx="http://schemas.microsoft.com/office/drawing/2014/chartex" xmlns:cx1="http://schemas.microsoft.com/office/drawing/2015/9/8/chartex" xmlns:cx2="http://schemas.microsoft.com/office/drawing/2015/10/21/chartex" xmlns:cx3="http://schemas.microsoft.com/office/drawing/2016/5/9/chartex" xmlns:cx4="http://schemas.microsoft.com/office/drawing/2016/5/10/chartex" xmlns:cx5="http://schemas.microsoft.com/office/drawing/2016/5/11/chartex" xmlns:cx6="http://schemas.microsoft.com/office/drawing/2016/5/12/chartex" xmlns:cx7="http://schemas.microsoft.com/office/drawing/2016/5/13/chartex" xmlns:cx8="http://schemas.microsoft.com/office/drawing/2016/5/14/chartex" xmlns:mc="http://schemas.openxmlformats.org/markup-compatibility/2006" xmlns:aink="http://schemas.microsoft.com/office/drawing/2016/ink" xmlns:am3d="http://schemas.microsoft.com/office/drawing/2017/model3d" xmlns:o="urn:schemas-microsoft-com:office:office" xmlns:oel="http://schemas.microsoft.com/office/2019/extlst" xmlns:r="http://schemas.openxmlformats.org/officeDocument/2006/relationships" xmlns:m="http://schemas.openxmlformats.org/officeDocument/2006/math" xmlns:v="urn:schemas-microsoft-com:vml" xmlns:wp14="http://schemas.microsoft.com/office/word/2010/wordprocessingDrawing" xmlns:wp="http://schemas.openxmlformats.org/drawingml/2006/wordprocessingDrawing" xmlns:w10="urn:schemas-microsoft-com:office:word" xmlns:w="http://schemas.openxmlformats.org/wordprocessingml/2006/main" xmlns:w14="http://schemas.microsoft.com/office/word/2010/wordml" xmlns:w15="http://schemas.microsoft.com/office/word/2012/wordml" xmlns:w16cex="http://schemas.microsoft.com/office/word/2018/wordml/cex" xmlns:w16cid="http://schemas.microsoft.com/office/word/2016/wordml/cid" xmlns:w16="http://schemas.microsoft.com/office/word/2018/wordml" xmlns:w16du="http://schemas.microsoft.com/office/word/2023/wordml/word16du" xmlns:w16sdtdh="http://schemas.microsoft.com/office/word/2020/wordml/sdtdatahash" xmlns:w16se="http://schemas.microsoft.com/office/word/2015/wordml/symex" xmlns:wpg="http://schemas.microsoft.com/office/word/2010/wordprocessingGroup" xmlns:wpi="http://schemas.microsoft.com/office/word/2010/wordprocessingInk" xmlns:wne="http://schemas.microsoft.com/office/word/2006/wordml" xmlns:wps="http://schemas.microsoft.com/office/word/2010/wordprocessingShape" mc:Ignorable="w14 w15 w16se w16cid w16 w16cex w16sdtdh w16du wp14">
   <w:abstractNum w:abstractNumId="0" w15:restartNumberingAfterBreak="0">
+    <w:nsid w:val="03476C6E"/>
+    <w:multiLevelType w:val="multilevel"/>
+    <w:tmpl w:val="ECF65A7C"/>
+    <w:lvl w:ilvl="0">
+      <w:start w:val="1"/>
+      <w:numFmt w:val="bullet"/>
+      <w:lvlText w:val=""/>
+      <w:lvlJc w:val="left"/>
+      <w:pPr>
+        <w:tabs>
+          <w:tab w:val="num" w:pos="720"/>
+        </w:tabs>
+        <w:ind w:left="720" w:hanging="360"/>
+      </w:pPr>
+      <w:rPr>
+        <w:rFonts w:ascii="Symbol" w:hAnsi="Symbol" w:hint="default"/>
+        <w:sz w:val="20"/>
+      </w:rPr>
+    </w:lvl>
+    <w:lvl w:ilvl="1" w:tentative="1">
+      <w:start w:val="1"/>
+      <w:numFmt w:val="bullet"/>
+      <w:lvlText w:val="o"/>
+      <w:lvlJc w:val="left"/>
+      <w:pPr>
+        <w:tabs>
+          <w:tab w:val="num" w:pos="1440"/>
+        </w:tabs>
+        <w:ind w:left="1440" w:hanging="360"/>
+      </w:pPr>
+      <w:rPr>
+        <w:rFonts w:ascii="Courier New" w:hAnsi="Courier New" w:hint="default"/>
+        <w:sz w:val="20"/>
+      </w:rPr>
+    </w:lvl>
+    <w:lvl w:ilvl="2" w:tentative="1">
+      <w:start w:val="1"/>
+      <w:numFmt w:val="bullet"/>
+      <w:lvlText w:val=""/>
+      <w:lvlJc w:val="left"/>
+      <w:pPr>
+        <w:tabs>
+          <w:tab w:val="num" w:pos="2160"/>
+        </w:tabs>
+        <w:ind w:left="2160" w:hanging="360"/>
+      </w:pPr>
+      <w:rPr>
+        <w:rFonts w:ascii="Wingdings" w:hAnsi="Wingdings" w:hint="default"/>
+        <w:sz w:val="20"/>
+      </w:rPr>
+    </w:lvl>
+    <w:lvl w:ilvl="3" w:tentative="1">
+      <w:start w:val="1"/>
+      <w:numFmt w:val="bullet"/>
+      <w:lvlText w:val=""/>
+      <w:lvlJc w:val="left"/>
+      <w:pPr>
+        <w:tabs>
+          <w:tab w:val="num" w:pos="2880"/>
+        </w:tabs>
+        <w:ind w:left="2880" w:hanging="360"/>
+      </w:pPr>
+      <w:rPr>
+        <w:rFonts w:ascii="Wingdings" w:hAnsi="Wingdings" w:hint="default"/>
+        <w:sz w:val="20"/>
+      </w:rPr>
+    </w:lvl>
+    <w:lvl w:ilvl="4" w:tentative="1">
+      <w:start w:val="1"/>
+      <w:numFmt w:val="bullet"/>
+      <w:lvlText w:val=""/>
+      <w:lvlJc w:val="left"/>
+      <w:pPr>
+        <w:tabs>
+          <w:tab w:val="num" w:pos="3600"/>
+        </w:tabs>
+        <w:ind w:left="3600" w:hanging="360"/>
+      </w:pPr>
+      <w:rPr>
+        <w:rFonts w:ascii="Wingdings" w:hAnsi="Wingdings" w:hint="default"/>
+        <w:sz w:val="20"/>
+      </w:rPr>
+    </w:lvl>
+    <w:lvl w:ilvl="5" w:tentative="1">
+      <w:start w:val="1"/>
+      <w:numFmt w:val="bullet"/>
+      <w:lvlText w:val=""/>
+      <w:lvlJc w:val="left"/>
+      <w:pPr>
+        <w:tabs>
+          <w:tab w:val="num" w:pos="4320"/>
+        </w:tabs>
+        <w:ind w:left="4320" w:hanging="360"/>
+      </w:pPr>
+      <w:rPr>
+        <w:rFonts w:ascii="Wingdings" w:hAnsi="Wingdings" w:hint="default"/>
+        <w:sz w:val="20"/>
+      </w:rPr>
+    </w:lvl>
+    <w:lvl w:ilvl="6" w:tentative="1">
+      <w:start w:val="1"/>
+      <w:numFmt w:val="bullet"/>
+      <w:lvlText w:val=""/>
+      <w:lvlJc w:val="left"/>
+      <w:pPr>
+        <w:tabs>
+          <w:tab w:val="num" w:pos="5040"/>
+        </w:tabs>
+        <w:ind w:left="5040" w:hanging="360"/>
+      </w:pPr>
+      <w:rPr>
+        <w:rFonts w:ascii="Wingdings" w:hAnsi="Wingdings" w:hint="default"/>
+        <w:sz w:val="20"/>
+      </w:rPr>
+    </w:lvl>
+    <w:lvl w:ilvl="7" w:tentative="1">
+      <w:start w:val="1"/>
+      <w:numFmt w:val="bullet"/>
+      <w:lvlText w:val=""/>
+      <w:lvlJc w:val="left"/>
+      <w:pPr>
+        <w:tabs>
+          <w:tab w:val="num" w:pos="5760"/>
+        </w:tabs>
+        <w:ind w:left="5760" w:hanging="360"/>
+      </w:pPr>
+      <w:rPr>
+        <w:rFonts w:ascii="Wingdings" w:hAnsi="Wingdings" w:hint="default"/>
+        <w:sz w:val="20"/>
+      </w:rPr>
+    </w:lvl>
+    <w:lvl w:ilvl="8" w:tentative="1">
+      <w:start w:val="1"/>
+      <w:numFmt w:val="bullet"/>
+      <w:lvlText w:val=""/>
+      <w:lvlJc w:val="left"/>
+      <w:pPr>
+        <w:tabs>
+          <w:tab w:val="num" w:pos="6480"/>
+        </w:tabs>
+        <w:ind w:left="6480" w:hanging="360"/>
+      </w:pPr>
+      <w:rPr>
+        <w:rFonts w:ascii="Wingdings" w:hAnsi="Wingdings" w:hint="default"/>
+        <w:sz w:val="20"/>
+      </w:rPr>
+    </w:lvl>
+  </w:abstractNum>
+  <w:abstractNum w:abstractNumId="1" w15:restartNumberingAfterBreak="0">
+    <w:nsid w:val="03AA3BA1"/>
+    <w:multiLevelType w:val="multilevel"/>
+    <w:tmpl w:val="85849B2A"/>
+    <w:lvl w:ilvl="0">
+      <w:start w:val="1"/>
+      <w:numFmt w:val="bullet"/>
+      <w:lvlText w:val=""/>
+      <w:lvlJc w:val="left"/>
+      <w:pPr>
+        <w:tabs>
+          <w:tab w:val="num" w:pos="720"/>
+        </w:tabs>
+        <w:ind w:left="720" w:hanging="360"/>
+      </w:pPr>
+      <w:rPr>
+        <w:rFonts w:ascii="Symbol" w:hAnsi="Symbol" w:hint="default"/>
+        <w:sz w:val="20"/>
+      </w:rPr>
+    </w:lvl>
+    <w:lvl w:ilvl="1" w:tentative="1">
+      <w:start w:val="1"/>
+      <w:numFmt w:val="bullet"/>
+      <w:lvlText w:val="o"/>
+      <w:lvlJc w:val="left"/>
+      <w:pPr>
+        <w:tabs>
+          <w:tab w:val="num" w:pos="1440"/>
+        </w:tabs>
+        <w:ind w:left="1440" w:hanging="360"/>
+      </w:pPr>
+      <w:rPr>
+        <w:rFonts w:ascii="Courier New" w:hAnsi="Courier New" w:hint="default"/>
+        <w:sz w:val="20"/>
+      </w:rPr>
+    </w:lvl>
+    <w:lvl w:ilvl="2" w:tentative="1">
+      <w:start w:val="1"/>
+      <w:numFmt w:val="bullet"/>
+      <w:lvlText w:val=""/>
+      <w:lvlJc w:val="left"/>
+      <w:pPr>
+        <w:tabs>
+          <w:tab w:val="num" w:pos="2160"/>
+        </w:tabs>
+        <w:ind w:left="2160" w:hanging="360"/>
+      </w:pPr>
+      <w:rPr>
+        <w:rFonts w:ascii="Wingdings" w:hAnsi="Wingdings" w:hint="default"/>
+        <w:sz w:val="20"/>
+      </w:rPr>
+    </w:lvl>
+    <w:lvl w:ilvl="3" w:tentative="1">
+      <w:start w:val="1"/>
+      <w:numFmt w:val="bullet"/>
+      <w:lvlText w:val=""/>
+      <w:lvlJc w:val="left"/>
+      <w:pPr>
+        <w:tabs>
+          <w:tab w:val="num" w:pos="2880"/>
+        </w:tabs>
+        <w:ind w:left="2880" w:hanging="360"/>
+      </w:pPr>
+      <w:rPr>
+        <w:rFonts w:ascii="Wingdings" w:hAnsi="Wingdings" w:hint="default"/>
+        <w:sz w:val="20"/>
+      </w:rPr>
+    </w:lvl>
+    <w:lvl w:ilvl="4" w:tentative="1">
+      <w:start w:val="1"/>
+      <w:numFmt w:val="bullet"/>
+      <w:lvlText w:val=""/>
+      <w:lvlJc w:val="left"/>
+      <w:pPr>
+        <w:tabs>
+          <w:tab w:val="num" w:pos="3600"/>
+        </w:tabs>
+        <w:ind w:left="3600" w:hanging="360"/>
+      </w:pPr>
+      <w:rPr>
+        <w:rFonts w:ascii="Wingdings" w:hAnsi="Wingdings" w:hint="default"/>
+        <w:sz w:val="20"/>
+      </w:rPr>
+    </w:lvl>
+    <w:lvl w:ilvl="5" w:tentative="1">
+      <w:start w:val="1"/>
+      <w:numFmt w:val="bullet"/>
+      <w:lvlText w:val=""/>
+      <w:lvlJc w:val="left"/>
+      <w:pPr>
+        <w:tabs>
+          <w:tab w:val="num" w:pos="4320"/>
+        </w:tabs>
+        <w:ind w:left="4320" w:hanging="360"/>
+      </w:pPr>
+      <w:rPr>
+        <w:rFonts w:ascii="Wingdings" w:hAnsi="Wingdings" w:hint="default"/>
+        <w:sz w:val="20"/>
+      </w:rPr>
+    </w:lvl>
+    <w:lvl w:ilvl="6" w:tentative="1">
+      <w:start w:val="1"/>
+      <w:numFmt w:val="bullet"/>
+      <w:lvlText w:val=""/>
+      <w:lvlJc w:val="left"/>
+      <w:pPr>
+        <w:tabs>
+          <w:tab w:val="num" w:pos="5040"/>
+        </w:tabs>
+        <w:ind w:left="5040" w:hanging="360"/>
+      </w:pPr>
+      <w:rPr>
+        <w:rFonts w:ascii="Wingdings" w:hAnsi="Wingdings" w:hint="default"/>
+        <w:sz w:val="20"/>
+      </w:rPr>
+    </w:lvl>
+    <w:lvl w:ilvl="7" w:tentative="1">
+      <w:start w:val="1"/>
+      <w:numFmt w:val="bullet"/>
+      <w:lvlText w:val=""/>
+      <w:lvlJc w:val="left"/>
+      <w:pPr>
+        <w:tabs>
+          <w:tab w:val="num" w:pos="5760"/>
+        </w:tabs>
+        <w:ind w:left="5760" w:hanging="360"/>
+      </w:pPr>
+      <w:rPr>
+        <w:rFonts w:ascii="Wingdings" w:hAnsi="Wingdings" w:hint="default"/>
+        <w:sz w:val="20"/>
+      </w:rPr>
+    </w:lvl>
+    <w:lvl w:ilvl="8" w:tentative="1">
+      <w:start w:val="1"/>
+      <w:numFmt w:val="bullet"/>
+      <w:lvlText w:val=""/>
+      <w:lvlJc w:val="left"/>
+      <w:pPr>
+        <w:tabs>
+          <w:tab w:val="num" w:pos="6480"/>
+        </w:tabs>
+        <w:ind w:left="6480" w:hanging="360"/>
+      </w:pPr>
+      <w:rPr>
+        <w:rFonts w:ascii="Wingdings" w:hAnsi="Wingdings" w:hint="default"/>
+        <w:sz w:val="20"/>
+      </w:rPr>
+    </w:lvl>
+  </w:abstractNum>
+  <w:abstractNum w:abstractNumId="2" w15:restartNumberingAfterBreak="0">
+    <w:nsid w:val="087659F7"/>
+    <w:multiLevelType w:val="multilevel"/>
+    <w:tmpl w:val="4F6A2B52"/>
+    <w:lvl w:ilvl="0">
+      <w:start w:val="1"/>
+      <w:numFmt w:val="bullet"/>
+      <w:lvlText w:val=""/>
+      <w:lvlJc w:val="left"/>
+      <w:pPr>
+        <w:tabs>
+          <w:tab w:val="num" w:pos="720"/>
+        </w:tabs>
+        <w:ind w:left="720" w:hanging="360"/>
+      </w:pPr>
+      <w:rPr>
+        <w:rFonts w:ascii="Symbol" w:hAnsi="Symbol" w:hint="default"/>
+        <w:sz w:val="20"/>
+      </w:rPr>
+    </w:lvl>
+    <w:lvl w:ilvl="1" w:tentative="1">
+      <w:start w:val="1"/>
+      <w:numFmt w:val="bullet"/>
+      <w:lvlText w:val="o"/>
+      <w:lvlJc w:val="left"/>
+      <w:pPr>
+        <w:tabs>
+          <w:tab w:val="num" w:pos="1440"/>
+        </w:tabs>
+        <w:ind w:left="1440" w:hanging="360"/>
+      </w:pPr>
+      <w:rPr>
+        <w:rFonts w:ascii="Courier New" w:hAnsi="Courier New" w:hint="default"/>
+        <w:sz w:val="20"/>
+      </w:rPr>
+    </w:lvl>
+    <w:lvl w:ilvl="2" w:tentative="1">
+      <w:start w:val="1"/>
+      <w:numFmt w:val="bullet"/>
+      <w:lvlText w:val=""/>
+      <w:lvlJc w:val="left"/>
+      <w:pPr>
+        <w:tabs>
+          <w:tab w:val="num" w:pos="2160"/>
+        </w:tabs>
+        <w:ind w:left="2160" w:hanging="360"/>
+      </w:pPr>
+      <w:rPr>
+        <w:rFonts w:ascii="Wingdings" w:hAnsi="Wingdings" w:hint="default"/>
+        <w:sz w:val="20"/>
+      </w:rPr>
+    </w:lvl>
+    <w:lvl w:ilvl="3" w:tentative="1">
+      <w:start w:val="1"/>
+      <w:numFmt w:val="bullet"/>
+      <w:lvlText w:val=""/>
+      <w:lvlJc w:val="left"/>
+      <w:pPr>
+        <w:tabs>
+          <w:tab w:val="num" w:pos="2880"/>
+        </w:tabs>
+        <w:ind w:left="2880" w:hanging="360"/>
+      </w:pPr>
+      <w:rPr>
+        <w:rFonts w:ascii="Wingdings" w:hAnsi="Wingdings" w:hint="default"/>
+        <w:sz w:val="20"/>
+      </w:rPr>
+    </w:lvl>
+    <w:lvl w:ilvl="4" w:tentative="1">
+      <w:start w:val="1"/>
+      <w:numFmt w:val="bullet"/>
+      <w:lvlText w:val=""/>
+      <w:lvlJc w:val="left"/>
+      <w:pPr>
+        <w:tabs>
+          <w:tab w:val="num" w:pos="3600"/>
+        </w:tabs>
+        <w:ind w:left="3600" w:hanging="360"/>
+      </w:pPr>
+      <w:rPr>
+        <w:rFonts w:ascii="Wingdings" w:hAnsi="Wingdings" w:hint="default"/>
+        <w:sz w:val="20"/>
+      </w:rPr>
+    </w:lvl>
+    <w:lvl w:ilvl="5" w:tentative="1">
+      <w:start w:val="1"/>
+      <w:numFmt w:val="bullet"/>
+      <w:lvlText w:val=""/>
+      <w:lvlJc w:val="left"/>
+      <w:pPr>
+        <w:tabs>
+          <w:tab w:val="num" w:pos="4320"/>
+        </w:tabs>
+        <w:ind w:left="4320" w:hanging="360"/>
+      </w:pPr>
+      <w:rPr>
+        <w:rFonts w:ascii="Wingdings" w:hAnsi="Wingdings" w:hint="default"/>
+        <w:sz w:val="20"/>
+      </w:rPr>
+    </w:lvl>
+    <w:lvl w:ilvl="6" w:tentative="1">
+      <w:start w:val="1"/>
+      <w:numFmt w:val="bullet"/>
+      <w:lvlText w:val=""/>
+      <w:lvlJc w:val="left"/>
+      <w:pPr>
+        <w:tabs>
+          <w:tab w:val="num" w:pos="5040"/>
+        </w:tabs>
+        <w:ind w:left="5040" w:hanging="360"/>
+      </w:pPr>
+      <w:rPr>
+        <w:rFonts w:ascii="Wingdings" w:hAnsi="Wingdings" w:hint="default"/>
+        <w:sz w:val="20"/>
+      </w:rPr>
+    </w:lvl>
+    <w:lvl w:ilvl="7" w:tentative="1">
+      <w:start w:val="1"/>
+      <w:numFmt w:val="bullet"/>
+      <w:lvlText w:val=""/>
+      <w:lvlJc w:val="left"/>
+      <w:pPr>
+        <w:tabs>
+          <w:tab w:val="num" w:pos="5760"/>
+        </w:tabs>
+        <w:ind w:left="5760" w:hanging="360"/>
+      </w:pPr>
+      <w:rPr>
+        <w:rFonts w:ascii="Wingdings" w:hAnsi="Wingdings" w:hint="default"/>
+        <w:sz w:val="20"/>
+      </w:rPr>
+    </w:lvl>
+    <w:lvl w:ilvl="8" w:tentative="1">
+      <w:start w:val="1"/>
+      <w:numFmt w:val="bullet"/>
+      <w:lvlText w:val=""/>
+      <w:lvlJc w:val="left"/>
+      <w:pPr>
+        <w:tabs>
+          <w:tab w:val="num" w:pos="6480"/>
+        </w:tabs>
+        <w:ind w:left="6480" w:hanging="360"/>
+      </w:pPr>
+      <w:rPr>
+        <w:rFonts w:ascii="Wingdings" w:hAnsi="Wingdings" w:hint="default"/>
+        <w:sz w:val="20"/>
+      </w:rPr>
+    </w:lvl>
+  </w:abstractNum>
+  <w:abstractNum w:abstractNumId="3" w15:restartNumberingAfterBreak="0">
+    <w:nsid w:val="09301BE0"/>
+    <w:multiLevelType w:val="multilevel"/>
+    <w:tmpl w:val="2A8CC1D8"/>
+    <w:lvl w:ilvl="0">
+      <w:start w:val="1"/>
+      <w:numFmt w:val="bullet"/>
+      <w:lvlText w:val=""/>
+      <w:lvlJc w:val="left"/>
+      <w:pPr>
+        <w:tabs>
+          <w:tab w:val="num" w:pos="720"/>
+        </w:tabs>
+        <w:ind w:left="720" w:hanging="360"/>
+      </w:pPr>
+      <w:rPr>
+        <w:rFonts w:ascii="Symbol" w:hAnsi="Symbol" w:hint="default"/>
+        <w:sz w:val="20"/>
+      </w:rPr>
+    </w:lvl>
+    <w:lvl w:ilvl="1" w:tentative="1">
+      <w:start w:val="1"/>
+      <w:numFmt w:val="bullet"/>
+      <w:lvlText w:val="o"/>
+      <w:lvlJc w:val="left"/>
+      <w:pPr>
+        <w:tabs>
+          <w:tab w:val="num" w:pos="1440"/>
+        </w:tabs>
+        <w:ind w:left="1440" w:hanging="360"/>
+      </w:pPr>
+      <w:rPr>
+        <w:rFonts w:ascii="Courier New" w:hAnsi="Courier New" w:hint="default"/>
+        <w:sz w:val="20"/>
+      </w:rPr>
+    </w:lvl>
+    <w:lvl w:ilvl="2" w:tentative="1">
+      <w:start w:val="1"/>
+      <w:numFmt w:val="bullet"/>
+      <w:lvlText w:val=""/>
+      <w:lvlJc w:val="left"/>
+      <w:pPr>
+        <w:tabs>
+          <w:tab w:val="num" w:pos="2160"/>
+        </w:tabs>
+        <w:ind w:left="2160" w:hanging="360"/>
+      </w:pPr>
+      <w:rPr>
+        <w:rFonts w:ascii="Wingdings" w:hAnsi="Wingdings" w:hint="default"/>
+        <w:sz w:val="20"/>
+      </w:rPr>
+    </w:lvl>
+    <w:lvl w:ilvl="3" w:tentative="1">
+      <w:start w:val="1"/>
+      <w:numFmt w:val="bullet"/>
+      <w:lvlText w:val=""/>
+      <w:lvlJc w:val="left"/>
+      <w:pPr>
+        <w:tabs>
+          <w:tab w:val="num" w:pos="2880"/>
+        </w:tabs>
+        <w:ind w:left="2880" w:hanging="360"/>
+      </w:pPr>
+      <w:rPr>
+        <w:rFonts w:ascii="Wingdings" w:hAnsi="Wingdings" w:hint="default"/>
+        <w:sz w:val="20"/>
+      </w:rPr>
+    </w:lvl>
+    <w:lvl w:ilvl="4" w:tentative="1">
+      <w:start w:val="1"/>
+      <w:numFmt w:val="bullet"/>
+      <w:lvlText w:val=""/>
+      <w:lvlJc w:val="left"/>
+      <w:pPr>
+        <w:tabs>
+          <w:tab w:val="num" w:pos="3600"/>
+        </w:tabs>
+        <w:ind w:left="3600" w:hanging="360"/>
+      </w:pPr>
+      <w:rPr>
+        <w:rFonts w:ascii="Wingdings" w:hAnsi="Wingdings" w:hint="default"/>
+        <w:sz w:val="20"/>
+      </w:rPr>
+    </w:lvl>
+    <w:lvl w:ilvl="5" w:tentative="1">
+      <w:start w:val="1"/>
+      <w:numFmt w:val="bullet"/>
+      <w:lvlText w:val=""/>
+      <w:lvlJc w:val="left"/>
+      <w:pPr>
+        <w:tabs>
+          <w:tab w:val="num" w:pos="4320"/>
+        </w:tabs>
+        <w:ind w:left="4320" w:hanging="360"/>
+      </w:pPr>
+      <w:rPr>
+        <w:rFonts w:ascii="Wingdings" w:hAnsi="Wingdings" w:hint="default"/>
+        <w:sz w:val="20"/>
+      </w:rPr>
+    </w:lvl>
+    <w:lvl w:ilvl="6" w:tentative="1">
+      <w:start w:val="1"/>
+      <w:numFmt w:val="bullet"/>
+      <w:lvlText w:val=""/>
+      <w:lvlJc w:val="left"/>
+      <w:pPr>
+        <w:tabs>
+          <w:tab w:val="num" w:pos="5040"/>
+        </w:tabs>
+        <w:ind w:left="5040" w:hanging="360"/>
+      </w:pPr>
+      <w:rPr>
+        <w:rFonts w:ascii="Wingdings" w:hAnsi="Wingdings" w:hint="default"/>
+        <w:sz w:val="20"/>
+      </w:rPr>
+    </w:lvl>
+    <w:lvl w:ilvl="7" w:tentative="1">
+      <w:start w:val="1"/>
+      <w:numFmt w:val="bullet"/>
+      <w:lvlText w:val=""/>
+      <w:lvlJc w:val="left"/>
+      <w:pPr>
+        <w:tabs>
+          <w:tab w:val="num" w:pos="5760"/>
+        </w:tabs>
+        <w:ind w:left="5760" w:hanging="360"/>
+      </w:pPr>
+      <w:rPr>
+        <w:rFonts w:ascii="Wingdings" w:hAnsi="Wingdings" w:hint="default"/>
+        <w:sz w:val="20"/>
+      </w:rPr>
+    </w:lvl>
+    <w:lvl w:ilvl="8" w:tentative="1">
+      <w:start w:val="1"/>
+      <w:numFmt w:val="bullet"/>
+      <w:lvlText w:val=""/>
+      <w:lvlJc w:val="left"/>
+      <w:pPr>
+        <w:tabs>
+          <w:tab w:val="num" w:pos="6480"/>
+        </w:tabs>
+        <w:ind w:left="6480" w:hanging="360"/>
+      </w:pPr>
+      <w:rPr>
+        <w:rFonts w:ascii="Wingdings" w:hAnsi="Wingdings" w:hint="default"/>
+        <w:sz w:val="20"/>
+      </w:rPr>
+    </w:lvl>
+  </w:abstractNum>
+  <w:abstractNum w:abstractNumId="4" w15:restartNumberingAfterBreak="0">
+    <w:nsid w:val="0A2E364C"/>
+    <w:multiLevelType w:val="multilevel"/>
+    <w:tmpl w:val="801C4554"/>
+    <w:lvl w:ilvl="0">
+      <w:start w:val="1"/>
+      <w:numFmt w:val="bullet"/>
+      <w:lvlText w:val=""/>
+      <w:lvlJc w:val="left"/>
+      <w:pPr>
+        <w:tabs>
+          <w:tab w:val="num" w:pos="720"/>
+        </w:tabs>
+        <w:ind w:left="720" w:hanging="360"/>
+      </w:pPr>
+      <w:rPr>
+        <w:rFonts w:ascii="Symbol" w:hAnsi="Symbol" w:hint="default"/>
+        <w:sz w:val="20"/>
+      </w:rPr>
+    </w:lvl>
+    <w:lvl w:ilvl="1" w:tentative="1">
+      <w:start w:val="1"/>
+      <w:numFmt w:val="bullet"/>
+      <w:lvlText w:val="o"/>
+      <w:lvlJc w:val="left"/>
+      <w:pPr>
+        <w:tabs>
+          <w:tab w:val="num" w:pos="1440"/>
+        </w:tabs>
+        <w:ind w:left="1440" w:hanging="360"/>
+      </w:pPr>
+      <w:rPr>
+        <w:rFonts w:ascii="Courier New" w:hAnsi="Courier New" w:hint="default"/>
+        <w:sz w:val="20"/>
+      </w:rPr>
+    </w:lvl>
+    <w:lvl w:ilvl="2" w:tentative="1">
+      <w:start w:val="1"/>
+      <w:numFmt w:val="bullet"/>
+      <w:lvlText w:val=""/>
+      <w:lvlJc w:val="left"/>
+      <w:pPr>
+        <w:tabs>
+          <w:tab w:val="num" w:pos="2160"/>
+        </w:tabs>
+        <w:ind w:left="2160" w:hanging="360"/>
+      </w:pPr>
+      <w:rPr>
+        <w:rFonts w:ascii="Wingdings" w:hAnsi="Wingdings" w:hint="default"/>
+        <w:sz w:val="20"/>
+      </w:rPr>
+    </w:lvl>
+    <w:lvl w:ilvl="3" w:tentative="1">
+      <w:start w:val="1"/>
+      <w:numFmt w:val="bullet"/>
+      <w:lvlText w:val=""/>
+      <w:lvlJc w:val="left"/>
+      <w:pPr>
+        <w:tabs>
+          <w:tab w:val="num" w:pos="2880"/>
+        </w:tabs>
+        <w:ind w:left="2880" w:hanging="360"/>
+      </w:pPr>
+      <w:rPr>
+        <w:rFonts w:ascii="Wingdings" w:hAnsi="Wingdings" w:hint="default"/>
+        <w:sz w:val="20"/>
+      </w:rPr>
+    </w:lvl>
+    <w:lvl w:ilvl="4" w:tentative="1">
+      <w:start w:val="1"/>
+      <w:numFmt w:val="bullet"/>
+      <w:lvlText w:val=""/>
+      <w:lvlJc w:val="left"/>
+      <w:pPr>
+        <w:tabs>
+          <w:tab w:val="num" w:pos="3600"/>
+        </w:tabs>
+        <w:ind w:left="3600" w:hanging="360"/>
+      </w:pPr>
+      <w:rPr>
+        <w:rFonts w:ascii="Wingdings" w:hAnsi="Wingdings" w:hint="default"/>
+        <w:sz w:val="20"/>
+      </w:rPr>
+    </w:lvl>
+    <w:lvl w:ilvl="5" w:tentative="1">
+      <w:start w:val="1"/>
+      <w:numFmt w:val="bullet"/>
+      <w:lvlText w:val=""/>
+      <w:lvlJc w:val="left"/>
+      <w:pPr>
+        <w:tabs>
+          <w:tab w:val="num" w:pos="4320"/>
+        </w:tabs>
+        <w:ind w:left="4320" w:hanging="360"/>
+      </w:pPr>
+      <w:rPr>
+        <w:rFonts w:ascii="Wingdings" w:hAnsi="Wingdings" w:hint="default"/>
+        <w:sz w:val="20"/>
+      </w:rPr>
+    </w:lvl>
+    <w:lvl w:ilvl="6" w:tentative="1">
+      <w:start w:val="1"/>
+      <w:numFmt w:val="bullet"/>
+      <w:lvlText w:val=""/>
+      <w:lvlJc w:val="left"/>
+      <w:pPr>
+        <w:tabs>
+          <w:tab w:val="num" w:pos="5040"/>
+        </w:tabs>
+        <w:ind w:left="5040" w:hanging="360"/>
+      </w:pPr>
+      <w:rPr>
+        <w:rFonts w:ascii="Wingdings" w:hAnsi="Wingdings" w:hint="default"/>
+        <w:sz w:val="20"/>
+      </w:rPr>
+    </w:lvl>
+    <w:lvl w:ilvl="7" w:tentative="1">
+      <w:start w:val="1"/>
+      <w:numFmt w:val="bullet"/>
+      <w:lvlText w:val=""/>
+      <w:lvlJc w:val="left"/>
+      <w:pPr>
+        <w:tabs>
+          <w:tab w:val="num" w:pos="5760"/>
+        </w:tabs>
+        <w:ind w:left="5760" w:hanging="360"/>
+      </w:pPr>
+      <w:rPr>
+        <w:rFonts w:ascii="Wingdings" w:hAnsi="Wingdings" w:hint="default"/>
+        <w:sz w:val="20"/>
+      </w:rPr>
+    </w:lvl>
+    <w:lvl w:ilvl="8" w:tentative="1">
+      <w:start w:val="1"/>
+      <w:numFmt w:val="bullet"/>
+      <w:lvlText w:val=""/>
+      <w:lvlJc w:val="left"/>
+      <w:pPr>
+        <w:tabs>
+          <w:tab w:val="num" w:pos="6480"/>
+        </w:tabs>
+        <w:ind w:left="6480" w:hanging="360"/>
+      </w:pPr>
+      <w:rPr>
+        <w:rFonts w:ascii="Wingdings" w:hAnsi="Wingdings" w:hint="default"/>
+        <w:sz w:val="20"/>
+      </w:rPr>
+    </w:lvl>
+  </w:abstractNum>
+  <w:abstractNum w:abstractNumId="5" w15:restartNumberingAfterBreak="0">
+    <w:nsid w:val="105C4F75"/>
+    <w:multiLevelType w:val="multilevel"/>
+    <w:tmpl w:val="1E74C252"/>
+    <w:lvl w:ilvl="0">
+      <w:start w:val="1"/>
+      <w:numFmt w:val="bullet"/>
+      <w:lvlText w:val=""/>
+      <w:lvlJc w:val="left"/>
+      <w:pPr>
+        <w:tabs>
+          <w:tab w:val="num" w:pos="720"/>
+        </w:tabs>
+        <w:ind w:left="720" w:hanging="360"/>
+      </w:pPr>
+      <w:rPr>
+        <w:rFonts w:ascii="Symbol" w:hAnsi="Symbol" w:hint="default"/>
+        <w:sz w:val="20"/>
+      </w:rPr>
+    </w:lvl>
+    <w:lvl w:ilvl="1" w:tentative="1">
+      <w:start w:val="1"/>
+      <w:numFmt w:val="bullet"/>
+      <w:lvlText w:val="o"/>
+      <w:lvlJc w:val="left"/>
+      <w:pPr>
+        <w:tabs>
+          <w:tab w:val="num" w:pos="1440"/>
+        </w:tabs>
+        <w:ind w:left="1440" w:hanging="360"/>
+      </w:pPr>
+      <w:rPr>
+        <w:rFonts w:ascii="Courier New" w:hAnsi="Courier New" w:hint="default"/>
+        <w:sz w:val="20"/>
+      </w:rPr>
+    </w:lvl>
+    <w:lvl w:ilvl="2" w:tentative="1">
+      <w:start w:val="1"/>
+      <w:numFmt w:val="bullet"/>
+      <w:lvlText w:val=""/>
+      <w:lvlJc w:val="left"/>
+      <w:pPr>
+        <w:tabs>
+          <w:tab w:val="num" w:pos="2160"/>
+        </w:tabs>
+        <w:ind w:left="2160" w:hanging="360"/>
+      </w:pPr>
+      <w:rPr>
+        <w:rFonts w:ascii="Wingdings" w:hAnsi="Wingdings" w:hint="default"/>
+        <w:sz w:val="20"/>
+      </w:rPr>
+    </w:lvl>
+    <w:lvl w:ilvl="3" w:tentative="1">
+      <w:start w:val="1"/>
+      <w:numFmt w:val="bullet"/>
+      <w:lvlText w:val=""/>
+      <w:lvlJc w:val="left"/>
+      <w:pPr>
+        <w:tabs>
+          <w:tab w:val="num" w:pos="2880"/>
+        </w:tabs>
+        <w:ind w:left="2880" w:hanging="360"/>
+      </w:pPr>
+      <w:rPr>
+        <w:rFonts w:ascii="Wingdings" w:hAnsi="Wingdings" w:hint="default"/>
+        <w:sz w:val="20"/>
+      </w:rPr>
+    </w:lvl>
+    <w:lvl w:ilvl="4" w:tentative="1">
+      <w:start w:val="1"/>
+      <w:numFmt w:val="bullet"/>
+      <w:lvlText w:val=""/>
+      <w:lvlJc w:val="left"/>
+      <w:pPr>
+        <w:tabs>
+          <w:tab w:val="num" w:pos="3600"/>
+        </w:tabs>
+        <w:ind w:left="3600" w:hanging="360"/>
+      </w:pPr>
+      <w:rPr>
+        <w:rFonts w:ascii="Wingdings" w:hAnsi="Wingdings" w:hint="default"/>
+        <w:sz w:val="20"/>
+      </w:rPr>
+    </w:lvl>
+    <w:lvl w:ilvl="5" w:tentative="1">
+      <w:start w:val="1"/>
+      <w:numFmt w:val="bullet"/>
+      <w:lvlText w:val=""/>
+      <w:lvlJc w:val="left"/>
+      <w:pPr>
+        <w:tabs>
+          <w:tab w:val="num" w:pos="4320"/>
+        </w:tabs>
+        <w:ind w:left="4320" w:hanging="360"/>
+      </w:pPr>
+      <w:rPr>
+        <w:rFonts w:ascii="Wingdings" w:hAnsi="Wingdings" w:hint="default"/>
+        <w:sz w:val="20"/>
+      </w:rPr>
+    </w:lvl>
+    <w:lvl w:ilvl="6" w:tentative="1">
+      <w:start w:val="1"/>
+      <w:numFmt w:val="bullet"/>
+      <w:lvlText w:val=""/>
+      <w:lvlJc w:val="left"/>
+      <w:pPr>
+        <w:tabs>
+          <w:tab w:val="num" w:pos="5040"/>
+        </w:tabs>
+        <w:ind w:left="5040" w:hanging="360"/>
+      </w:pPr>
+      <w:rPr>
+        <w:rFonts w:ascii="Wingdings" w:hAnsi="Wingdings" w:hint="default"/>
+        <w:sz w:val="20"/>
+      </w:rPr>
+    </w:lvl>
+    <w:lvl w:ilvl="7" w:tentative="1">
+      <w:start w:val="1"/>
+      <w:numFmt w:val="bullet"/>
+      <w:lvlText w:val=""/>
+      <w:lvlJc w:val="left"/>
+      <w:pPr>
+        <w:tabs>
+          <w:tab w:val="num" w:pos="5760"/>
+        </w:tabs>
+        <w:ind w:left="5760" w:hanging="360"/>
+      </w:pPr>
+      <w:rPr>
+        <w:rFonts w:ascii="Wingdings" w:hAnsi="Wingdings" w:hint="default"/>
+        <w:sz w:val="20"/>
+      </w:rPr>
+    </w:lvl>
+    <w:lvl w:ilvl="8" w:tentative="1">
+      <w:start w:val="1"/>
+      <w:numFmt w:val="bullet"/>
+      <w:lvlText w:val=""/>
+      <w:lvlJc w:val="left"/>
+      <w:pPr>
+        <w:tabs>
+          <w:tab w:val="num" w:pos="6480"/>
+        </w:tabs>
+        <w:ind w:left="6480" w:hanging="360"/>
+      </w:pPr>
+      <w:rPr>
+        <w:rFonts w:ascii="Wingdings" w:hAnsi="Wingdings" w:hint="default"/>
+        <w:sz w:val="20"/>
+      </w:rPr>
+    </w:lvl>
+  </w:abstractNum>
+  <w:abstractNum w:abstractNumId="6" w15:restartNumberingAfterBreak="0">
+    <w:nsid w:val="13FD0992"/>
+    <w:multiLevelType w:val="multilevel"/>
+    <w:tmpl w:val="C22CB1DA"/>
+    <w:lvl w:ilvl="0">
+      <w:start w:val="1"/>
+      <w:numFmt w:val="bullet"/>
+      <w:lvlText w:val=""/>
+      <w:lvlJc w:val="left"/>
+      <w:pPr>
+        <w:tabs>
+          <w:tab w:val="num" w:pos="720"/>
+        </w:tabs>
+        <w:ind w:left="720" w:hanging="360"/>
+      </w:pPr>
+      <w:rPr>
+        <w:rFonts w:ascii="Symbol" w:hAnsi="Symbol" w:hint="default"/>
+        <w:sz w:val="20"/>
+      </w:rPr>
+    </w:lvl>
+    <w:lvl w:ilvl="1" w:tentative="1">
+      <w:start w:val="1"/>
+      <w:numFmt w:val="bullet"/>
+      <w:lvlText w:val="o"/>
+      <w:lvlJc w:val="left"/>
+      <w:pPr>
+        <w:tabs>
+          <w:tab w:val="num" w:pos="1440"/>
+        </w:tabs>
+        <w:ind w:left="1440" w:hanging="360"/>
+      </w:pPr>
+      <w:rPr>
+        <w:rFonts w:ascii="Courier New" w:hAnsi="Courier New" w:hint="default"/>
+        <w:sz w:val="20"/>
+      </w:rPr>
+    </w:lvl>
+    <w:lvl w:ilvl="2" w:tentative="1">
+      <w:start w:val="1"/>
+      <w:numFmt w:val="bullet"/>
+      <w:lvlText w:val=""/>
+      <w:lvlJc w:val="left"/>
+      <w:pPr>
+        <w:tabs>
+          <w:tab w:val="num" w:pos="2160"/>
+        </w:tabs>
+        <w:ind w:left="2160" w:hanging="360"/>
+      </w:pPr>
+      <w:rPr>
+        <w:rFonts w:ascii="Wingdings" w:hAnsi="Wingdings" w:hint="default"/>
+        <w:sz w:val="20"/>
+      </w:rPr>
+    </w:lvl>
+    <w:lvl w:ilvl="3" w:tentative="1">
+      <w:start w:val="1"/>
+      <w:numFmt w:val="bullet"/>
+      <w:lvlText w:val=""/>
+      <w:lvlJc w:val="left"/>
+      <w:pPr>
+        <w:tabs>
+          <w:tab w:val="num" w:pos="2880"/>
+        </w:tabs>
+        <w:ind w:left="2880" w:hanging="360"/>
+      </w:pPr>
+      <w:rPr>
+        <w:rFonts w:ascii="Wingdings" w:hAnsi="Wingdings" w:hint="default"/>
+        <w:sz w:val="20"/>
+      </w:rPr>
+    </w:lvl>
+    <w:lvl w:ilvl="4" w:tentative="1">
+      <w:start w:val="1"/>
+      <w:numFmt w:val="bullet"/>
+      <w:lvlText w:val=""/>
+      <w:lvlJc w:val="left"/>
+      <w:pPr>
+        <w:tabs>
+          <w:tab w:val="num" w:pos="3600"/>
+        </w:tabs>
+        <w:ind w:left="3600" w:hanging="360"/>
+      </w:pPr>
+      <w:rPr>
+        <w:rFonts w:ascii="Wingdings" w:hAnsi="Wingdings" w:hint="default"/>
+        <w:sz w:val="20"/>
+      </w:rPr>
+    </w:lvl>
+    <w:lvl w:ilvl="5" w:tentative="1">
+      <w:start w:val="1"/>
+      <w:numFmt w:val="bullet"/>
+      <w:lvlText w:val=""/>
+      <w:lvlJc w:val="left"/>
+      <w:pPr>
+        <w:tabs>
+          <w:tab w:val="num" w:pos="4320"/>
+        </w:tabs>
+        <w:ind w:left="4320" w:hanging="360"/>
+      </w:pPr>
+      <w:rPr>
+        <w:rFonts w:ascii="Wingdings" w:hAnsi="Wingdings" w:hint="default"/>
+        <w:sz w:val="20"/>
+      </w:rPr>
+    </w:lvl>
+    <w:lvl w:ilvl="6" w:tentative="1">
+      <w:start w:val="1"/>
+      <w:numFmt w:val="bullet"/>
+      <w:lvlText w:val=""/>
+      <w:lvlJc w:val="left"/>
+      <w:pPr>
+        <w:tabs>
+          <w:tab w:val="num" w:pos="5040"/>
+        </w:tabs>
+        <w:ind w:left="5040" w:hanging="360"/>
+      </w:pPr>
+      <w:rPr>
+        <w:rFonts w:ascii="Wingdings" w:hAnsi="Wingdings" w:hint="default"/>
+        <w:sz w:val="20"/>
+      </w:rPr>
+    </w:lvl>
+    <w:lvl w:ilvl="7" w:tentative="1">
+      <w:start w:val="1"/>
+      <w:numFmt w:val="bullet"/>
+      <w:lvlText w:val=""/>
+      <w:lvlJc w:val="left"/>
+      <w:pPr>
+        <w:tabs>
+          <w:tab w:val="num" w:pos="5760"/>
+        </w:tabs>
+        <w:ind w:left="5760" w:hanging="360"/>
+      </w:pPr>
+      <w:rPr>
+        <w:rFonts w:ascii="Wingdings" w:hAnsi="Wingdings" w:hint="default"/>
+        <w:sz w:val="20"/>
+      </w:rPr>
+    </w:lvl>
+    <w:lvl w:ilvl="8" w:tentative="1">
+      <w:start w:val="1"/>
+      <w:numFmt w:val="bullet"/>
+      <w:lvlText w:val=""/>
+      <w:lvlJc w:val="left"/>
+      <w:pPr>
+        <w:tabs>
+          <w:tab w:val="num" w:pos="6480"/>
+        </w:tabs>
+        <w:ind w:left="6480" w:hanging="360"/>
+      </w:pPr>
+      <w:rPr>
+        <w:rFonts w:ascii="Wingdings" w:hAnsi="Wingdings" w:hint="default"/>
+        <w:sz w:val="20"/>
+      </w:rPr>
+    </w:lvl>
+  </w:abstractNum>
+  <w:abstractNum w:abstractNumId="7" w15:restartNumberingAfterBreak="0">
     <w:nsid w:val="14C27D16"/>
     <w:multiLevelType w:val="multilevel"/>
     <w:tmpl w:val="ED825C2A"/>
@@ -2380,7 +4846,7 @@
       </w:rPr>
     </w:lvl>
   </w:abstractNum>
-  <w:abstractNum w:abstractNumId="1" w15:restartNumberingAfterBreak="0">
+  <w:abstractNum w:abstractNumId="8" w15:restartNumberingAfterBreak="0">
     <w:nsid w:val="1CAF0D91"/>
     <w:multiLevelType w:val="multilevel"/>
     <w:tmpl w:val="3ADC77EE"/>
@@ -2529,7 +4995,7 @@
       </w:rPr>
     </w:lvl>
   </w:abstractNum>
-  <w:abstractNum w:abstractNumId="2" w15:restartNumberingAfterBreak="0">
+  <w:abstractNum w:abstractNumId="9" w15:restartNumberingAfterBreak="0">
     <w:nsid w:val="206B5C27"/>
     <w:multiLevelType w:val="multilevel"/>
     <w:tmpl w:val="207A2C7E"/>
@@ -2678,7 +5144,156 @@
       </w:rPr>
     </w:lvl>
   </w:abstractNum>
-  <w:abstractNum w:abstractNumId="3" w15:restartNumberingAfterBreak="0">
+  <w:abstractNum w:abstractNumId="10" w15:restartNumberingAfterBreak="0">
+    <w:nsid w:val="2EF65FAA"/>
+    <w:multiLevelType w:val="multilevel"/>
+    <w:tmpl w:val="912A7E90"/>
+    <w:lvl w:ilvl="0">
+      <w:start w:val="1"/>
+      <w:numFmt w:val="bullet"/>
+      <w:lvlText w:val=""/>
+      <w:lvlJc w:val="left"/>
+      <w:pPr>
+        <w:tabs>
+          <w:tab w:val="num" w:pos="720"/>
+        </w:tabs>
+        <w:ind w:left="720" w:hanging="360"/>
+      </w:pPr>
+      <w:rPr>
+        <w:rFonts w:ascii="Symbol" w:hAnsi="Symbol" w:hint="default"/>
+        <w:sz w:val="20"/>
+      </w:rPr>
+    </w:lvl>
+    <w:lvl w:ilvl="1" w:tentative="1">
+      <w:start w:val="1"/>
+      <w:numFmt w:val="bullet"/>
+      <w:lvlText w:val="o"/>
+      <w:lvlJc w:val="left"/>
+      <w:pPr>
+        <w:tabs>
+          <w:tab w:val="num" w:pos="1440"/>
+        </w:tabs>
+        <w:ind w:left="1440" w:hanging="360"/>
+      </w:pPr>
+      <w:rPr>
+        <w:rFonts w:ascii="Courier New" w:hAnsi="Courier New" w:hint="default"/>
+        <w:sz w:val="20"/>
+      </w:rPr>
+    </w:lvl>
+    <w:lvl w:ilvl="2" w:tentative="1">
+      <w:start w:val="1"/>
+      <w:numFmt w:val="bullet"/>
+      <w:lvlText w:val=""/>
+      <w:lvlJc w:val="left"/>
+      <w:pPr>
+        <w:tabs>
+          <w:tab w:val="num" w:pos="2160"/>
+        </w:tabs>
+        <w:ind w:left="2160" w:hanging="360"/>
+      </w:pPr>
+      <w:rPr>
+        <w:rFonts w:ascii="Wingdings" w:hAnsi="Wingdings" w:hint="default"/>
+        <w:sz w:val="20"/>
+      </w:rPr>
+    </w:lvl>
+    <w:lvl w:ilvl="3" w:tentative="1">
+      <w:start w:val="1"/>
+      <w:numFmt w:val="bullet"/>
+      <w:lvlText w:val=""/>
+      <w:lvlJc w:val="left"/>
+      <w:pPr>
+        <w:tabs>
+          <w:tab w:val="num" w:pos="2880"/>
+        </w:tabs>
+        <w:ind w:left="2880" w:hanging="360"/>
+      </w:pPr>
+      <w:rPr>
+        <w:rFonts w:ascii="Wingdings" w:hAnsi="Wingdings" w:hint="default"/>
+        <w:sz w:val="20"/>
+      </w:rPr>
+    </w:lvl>
+    <w:lvl w:ilvl="4" w:tentative="1">
+      <w:start w:val="1"/>
+      <w:numFmt w:val="bullet"/>
+      <w:lvlText w:val=""/>
+      <w:lvlJc w:val="left"/>
+      <w:pPr>
+        <w:tabs>
+          <w:tab w:val="num" w:pos="3600"/>
+        </w:tabs>
+        <w:ind w:left="3600" w:hanging="360"/>
+      </w:pPr>
+      <w:rPr>
+        <w:rFonts w:ascii="Wingdings" w:hAnsi="Wingdings" w:hint="default"/>
+        <w:sz w:val="20"/>
+      </w:rPr>
+    </w:lvl>
+    <w:lvl w:ilvl="5" w:tentative="1">
+      <w:start w:val="1"/>
+      <w:numFmt w:val="bullet"/>
+      <w:lvlText w:val=""/>
+      <w:lvlJc w:val="left"/>
+      <w:pPr>
+        <w:tabs>
+          <w:tab w:val="num" w:pos="4320"/>
+        </w:tabs>
+        <w:ind w:left="4320" w:hanging="360"/>
+      </w:pPr>
+      <w:rPr>
+        <w:rFonts w:ascii="Wingdings" w:hAnsi="Wingdings" w:hint="default"/>
+        <w:sz w:val="20"/>
+      </w:rPr>
+    </w:lvl>
+    <w:lvl w:ilvl="6" w:tentative="1">
+      <w:start w:val="1"/>
+      <w:numFmt w:val="bullet"/>
+      <w:lvlText w:val=""/>
+      <w:lvlJc w:val="left"/>
+      <w:pPr>
+        <w:tabs>
+          <w:tab w:val="num" w:pos="5040"/>
+        </w:tabs>
+        <w:ind w:left="5040" w:hanging="360"/>
+      </w:pPr>
+      <w:rPr>
+        <w:rFonts w:ascii="Wingdings" w:hAnsi="Wingdings" w:hint="default"/>
+        <w:sz w:val="20"/>
+      </w:rPr>
+    </w:lvl>
+    <w:lvl w:ilvl="7" w:tentative="1">
+      <w:start w:val="1"/>
+      <w:numFmt w:val="bullet"/>
+      <w:lvlText w:val=""/>
+      <w:lvlJc w:val="left"/>
+      <w:pPr>
+        <w:tabs>
+          <w:tab w:val="num" w:pos="5760"/>
+        </w:tabs>
+        <w:ind w:left="5760" w:hanging="360"/>
+      </w:pPr>
+      <w:rPr>
+        <w:rFonts w:ascii="Wingdings" w:hAnsi="Wingdings" w:hint="default"/>
+        <w:sz w:val="20"/>
+      </w:rPr>
+    </w:lvl>
+    <w:lvl w:ilvl="8" w:tentative="1">
+      <w:start w:val="1"/>
+      <w:numFmt w:val="bullet"/>
+      <w:lvlText w:val=""/>
+      <w:lvlJc w:val="left"/>
+      <w:pPr>
+        <w:tabs>
+          <w:tab w:val="num" w:pos="6480"/>
+        </w:tabs>
+        <w:ind w:left="6480" w:hanging="360"/>
+      </w:pPr>
+      <w:rPr>
+        <w:rFonts w:ascii="Wingdings" w:hAnsi="Wingdings" w:hint="default"/>
+        <w:sz w:val="20"/>
+      </w:rPr>
+    </w:lvl>
+  </w:abstractNum>
+  <w:abstractNum w:abstractNumId="11" w15:restartNumberingAfterBreak="0">
     <w:nsid w:val="305F7960"/>
     <w:multiLevelType w:val="multilevel"/>
     <w:tmpl w:val="47D4EDBC"/>
@@ -2827,7 +5442,7 @@
       </w:rPr>
     </w:lvl>
   </w:abstractNum>
-  <w:abstractNum w:abstractNumId="4" w15:restartNumberingAfterBreak="0">
+  <w:abstractNum w:abstractNumId="12" w15:restartNumberingAfterBreak="0">
     <w:nsid w:val="3E5459D4"/>
     <w:multiLevelType w:val="multilevel"/>
     <w:tmpl w:val="AD2E5598"/>
@@ -2976,7 +5591,7 @@
       </w:rPr>
     </w:lvl>
   </w:abstractNum>
-  <w:abstractNum w:abstractNumId="5" w15:restartNumberingAfterBreak="0">
+  <w:abstractNum w:abstractNumId="13" w15:restartNumberingAfterBreak="0">
     <w:nsid w:val="423D6E2B"/>
     <w:multiLevelType w:val="multilevel"/>
     <w:tmpl w:val="506EF07C"/>
@@ -3125,7 +5740,156 @@
       </w:rPr>
     </w:lvl>
   </w:abstractNum>
-  <w:abstractNum w:abstractNumId="6" w15:restartNumberingAfterBreak="0">
+  <w:abstractNum w:abstractNumId="14" w15:restartNumberingAfterBreak="0">
+    <w:nsid w:val="43A021FB"/>
+    <w:multiLevelType w:val="multilevel"/>
+    <w:tmpl w:val="9022E3F4"/>
+    <w:lvl w:ilvl="0">
+      <w:start w:val="1"/>
+      <w:numFmt w:val="bullet"/>
+      <w:lvlText w:val=""/>
+      <w:lvlJc w:val="left"/>
+      <w:pPr>
+        <w:tabs>
+          <w:tab w:val="num" w:pos="720"/>
+        </w:tabs>
+        <w:ind w:left="720" w:hanging="360"/>
+      </w:pPr>
+      <w:rPr>
+        <w:rFonts w:ascii="Symbol" w:hAnsi="Symbol" w:hint="default"/>
+        <w:sz w:val="20"/>
+      </w:rPr>
+    </w:lvl>
+    <w:lvl w:ilvl="1" w:tentative="1">
+      <w:start w:val="1"/>
+      <w:numFmt w:val="bullet"/>
+      <w:lvlText w:val="o"/>
+      <w:lvlJc w:val="left"/>
+      <w:pPr>
+        <w:tabs>
+          <w:tab w:val="num" w:pos="1440"/>
+        </w:tabs>
+        <w:ind w:left="1440" w:hanging="360"/>
+      </w:pPr>
+      <w:rPr>
+        <w:rFonts w:ascii="Courier New" w:hAnsi="Courier New" w:hint="default"/>
+        <w:sz w:val="20"/>
+      </w:rPr>
+    </w:lvl>
+    <w:lvl w:ilvl="2" w:tentative="1">
+      <w:start w:val="1"/>
+      <w:numFmt w:val="bullet"/>
+      <w:lvlText w:val=""/>
+      <w:lvlJc w:val="left"/>
+      <w:pPr>
+        <w:tabs>
+          <w:tab w:val="num" w:pos="2160"/>
+        </w:tabs>
+        <w:ind w:left="2160" w:hanging="360"/>
+      </w:pPr>
+      <w:rPr>
+        <w:rFonts w:ascii="Wingdings" w:hAnsi="Wingdings" w:hint="default"/>
+        <w:sz w:val="20"/>
+      </w:rPr>
+    </w:lvl>
+    <w:lvl w:ilvl="3" w:tentative="1">
+      <w:start w:val="1"/>
+      <w:numFmt w:val="bullet"/>
+      <w:lvlText w:val=""/>
+      <w:lvlJc w:val="left"/>
+      <w:pPr>
+        <w:tabs>
+          <w:tab w:val="num" w:pos="2880"/>
+        </w:tabs>
+        <w:ind w:left="2880" w:hanging="360"/>
+      </w:pPr>
+      <w:rPr>
+        <w:rFonts w:ascii="Wingdings" w:hAnsi="Wingdings" w:hint="default"/>
+        <w:sz w:val="20"/>
+      </w:rPr>
+    </w:lvl>
+    <w:lvl w:ilvl="4" w:tentative="1">
+      <w:start w:val="1"/>
+      <w:numFmt w:val="bullet"/>
+      <w:lvlText w:val=""/>
+      <w:lvlJc w:val="left"/>
+      <w:pPr>
+        <w:tabs>
+          <w:tab w:val="num" w:pos="3600"/>
+        </w:tabs>
+        <w:ind w:left="3600" w:hanging="360"/>
+      </w:pPr>
+      <w:rPr>
+        <w:rFonts w:ascii="Wingdings" w:hAnsi="Wingdings" w:hint="default"/>
+        <w:sz w:val="20"/>
+      </w:rPr>
+    </w:lvl>
+    <w:lvl w:ilvl="5" w:tentative="1">
+      <w:start w:val="1"/>
+      <w:numFmt w:val="bullet"/>
+      <w:lvlText w:val=""/>
+      <w:lvlJc w:val="left"/>
+      <w:pPr>
+        <w:tabs>
+          <w:tab w:val="num" w:pos="4320"/>
+        </w:tabs>
+        <w:ind w:left="4320" w:hanging="360"/>
+      </w:pPr>
+      <w:rPr>
+        <w:rFonts w:ascii="Wingdings" w:hAnsi="Wingdings" w:hint="default"/>
+        <w:sz w:val="20"/>
+      </w:rPr>
+    </w:lvl>
+    <w:lvl w:ilvl="6" w:tentative="1">
+      <w:start w:val="1"/>
+      <w:numFmt w:val="bullet"/>
+      <w:lvlText w:val=""/>
+      <w:lvlJc w:val="left"/>
+      <w:pPr>
+        <w:tabs>
+          <w:tab w:val="num" w:pos="5040"/>
+        </w:tabs>
+        <w:ind w:left="5040" w:hanging="360"/>
+      </w:pPr>
+      <w:rPr>
+        <w:rFonts w:ascii="Wingdings" w:hAnsi="Wingdings" w:hint="default"/>
+        <w:sz w:val="20"/>
+      </w:rPr>
+    </w:lvl>
+    <w:lvl w:ilvl="7" w:tentative="1">
+      <w:start w:val="1"/>
+      <w:numFmt w:val="bullet"/>
+      <w:lvlText w:val=""/>
+      <w:lvlJc w:val="left"/>
+      <w:pPr>
+        <w:tabs>
+          <w:tab w:val="num" w:pos="5760"/>
+        </w:tabs>
+        <w:ind w:left="5760" w:hanging="360"/>
+      </w:pPr>
+      <w:rPr>
+        <w:rFonts w:ascii="Wingdings" w:hAnsi="Wingdings" w:hint="default"/>
+        <w:sz w:val="20"/>
+      </w:rPr>
+    </w:lvl>
+    <w:lvl w:ilvl="8" w:tentative="1">
+      <w:start w:val="1"/>
+      <w:numFmt w:val="bullet"/>
+      <w:lvlText w:val=""/>
+      <w:lvlJc w:val="left"/>
+      <w:pPr>
+        <w:tabs>
+          <w:tab w:val="num" w:pos="6480"/>
+        </w:tabs>
+        <w:ind w:left="6480" w:hanging="360"/>
+      </w:pPr>
+      <w:rPr>
+        <w:rFonts w:ascii="Wingdings" w:hAnsi="Wingdings" w:hint="default"/>
+        <w:sz w:val="20"/>
+      </w:rPr>
+    </w:lvl>
+  </w:abstractNum>
+  <w:abstractNum w:abstractNumId="15" w15:restartNumberingAfterBreak="0">
     <w:nsid w:val="445C30E8"/>
     <w:multiLevelType w:val="multilevel"/>
     <w:tmpl w:val="EB3E4C22"/>
@@ -3274,7 +6038,7 @@
       </w:rPr>
     </w:lvl>
   </w:abstractNum>
-  <w:abstractNum w:abstractNumId="7" w15:restartNumberingAfterBreak="0">
+  <w:abstractNum w:abstractNumId="16" w15:restartNumberingAfterBreak="0">
     <w:nsid w:val="47AF3B0D"/>
     <w:multiLevelType w:val="multilevel"/>
     <w:tmpl w:val="56BAA47E"/>
@@ -3423,7 +6187,7 @@
       </w:rPr>
     </w:lvl>
   </w:abstractNum>
-  <w:abstractNum w:abstractNumId="8" w15:restartNumberingAfterBreak="0">
+  <w:abstractNum w:abstractNumId="17" w15:restartNumberingAfterBreak="0">
     <w:nsid w:val="4C1B747C"/>
     <w:multiLevelType w:val="multilevel"/>
     <w:tmpl w:val="00CE2DE0"/>
@@ -3572,7 +6336,305 @@
       </w:rPr>
     </w:lvl>
   </w:abstractNum>
-  <w:abstractNum w:abstractNumId="9" w15:restartNumberingAfterBreak="0">
+  <w:abstractNum w:abstractNumId="18" w15:restartNumberingAfterBreak="0">
+    <w:nsid w:val="4E4870A2"/>
+    <w:multiLevelType w:val="multilevel"/>
+    <w:tmpl w:val="87D6A35C"/>
+    <w:lvl w:ilvl="0">
+      <w:start w:val="1"/>
+      <w:numFmt w:val="bullet"/>
+      <w:lvlText w:val=""/>
+      <w:lvlJc w:val="left"/>
+      <w:pPr>
+        <w:tabs>
+          <w:tab w:val="num" w:pos="720"/>
+        </w:tabs>
+        <w:ind w:left="720" w:hanging="360"/>
+      </w:pPr>
+      <w:rPr>
+        <w:rFonts w:ascii="Symbol" w:hAnsi="Symbol" w:hint="default"/>
+        <w:sz w:val="20"/>
+      </w:rPr>
+    </w:lvl>
+    <w:lvl w:ilvl="1" w:tentative="1">
+      <w:start w:val="1"/>
+      <w:numFmt w:val="bullet"/>
+      <w:lvlText w:val="o"/>
+      <w:lvlJc w:val="left"/>
+      <w:pPr>
+        <w:tabs>
+          <w:tab w:val="num" w:pos="1440"/>
+        </w:tabs>
+        <w:ind w:left="1440" w:hanging="360"/>
+      </w:pPr>
+      <w:rPr>
+        <w:rFonts w:ascii="Courier New" w:hAnsi="Courier New" w:hint="default"/>
+        <w:sz w:val="20"/>
+      </w:rPr>
+    </w:lvl>
+    <w:lvl w:ilvl="2" w:tentative="1">
+      <w:start w:val="1"/>
+      <w:numFmt w:val="bullet"/>
+      <w:lvlText w:val=""/>
+      <w:lvlJc w:val="left"/>
+      <w:pPr>
+        <w:tabs>
+          <w:tab w:val="num" w:pos="2160"/>
+        </w:tabs>
+        <w:ind w:left="2160" w:hanging="360"/>
+      </w:pPr>
+      <w:rPr>
+        <w:rFonts w:ascii="Wingdings" w:hAnsi="Wingdings" w:hint="default"/>
+        <w:sz w:val="20"/>
+      </w:rPr>
+    </w:lvl>
+    <w:lvl w:ilvl="3" w:tentative="1">
+      <w:start w:val="1"/>
+      <w:numFmt w:val="bullet"/>
+      <w:lvlText w:val=""/>
+      <w:lvlJc w:val="left"/>
+      <w:pPr>
+        <w:tabs>
+          <w:tab w:val="num" w:pos="2880"/>
+        </w:tabs>
+        <w:ind w:left="2880" w:hanging="360"/>
+      </w:pPr>
+      <w:rPr>
+        <w:rFonts w:ascii="Wingdings" w:hAnsi="Wingdings" w:hint="default"/>
+        <w:sz w:val="20"/>
+      </w:rPr>
+    </w:lvl>
+    <w:lvl w:ilvl="4" w:tentative="1">
+      <w:start w:val="1"/>
+      <w:numFmt w:val="bullet"/>
+      <w:lvlText w:val=""/>
+      <w:lvlJc w:val="left"/>
+      <w:pPr>
+        <w:tabs>
+          <w:tab w:val="num" w:pos="3600"/>
+        </w:tabs>
+        <w:ind w:left="3600" w:hanging="360"/>
+      </w:pPr>
+      <w:rPr>
+        <w:rFonts w:ascii="Wingdings" w:hAnsi="Wingdings" w:hint="default"/>
+        <w:sz w:val="20"/>
+      </w:rPr>
+    </w:lvl>
+    <w:lvl w:ilvl="5" w:tentative="1">
+      <w:start w:val="1"/>
+      <w:numFmt w:val="bullet"/>
+      <w:lvlText w:val=""/>
+      <w:lvlJc w:val="left"/>
+      <w:pPr>
+        <w:tabs>
+          <w:tab w:val="num" w:pos="4320"/>
+        </w:tabs>
+        <w:ind w:left="4320" w:hanging="360"/>
+      </w:pPr>
+      <w:rPr>
+        <w:rFonts w:ascii="Wingdings" w:hAnsi="Wingdings" w:hint="default"/>
+        <w:sz w:val="20"/>
+      </w:rPr>
+    </w:lvl>
+    <w:lvl w:ilvl="6" w:tentative="1">
+      <w:start w:val="1"/>
+      <w:numFmt w:val="bullet"/>
+      <w:lvlText w:val=""/>
+      <w:lvlJc w:val="left"/>
+      <w:pPr>
+        <w:tabs>
+          <w:tab w:val="num" w:pos="5040"/>
+        </w:tabs>
+        <w:ind w:left="5040" w:hanging="360"/>
+      </w:pPr>
+      <w:rPr>
+        <w:rFonts w:ascii="Wingdings" w:hAnsi="Wingdings" w:hint="default"/>
+        <w:sz w:val="20"/>
+      </w:rPr>
+    </w:lvl>
+    <w:lvl w:ilvl="7" w:tentative="1">
+      <w:start w:val="1"/>
+      <w:numFmt w:val="bullet"/>
+      <w:lvlText w:val=""/>
+      <w:lvlJc w:val="left"/>
+      <w:pPr>
+        <w:tabs>
+          <w:tab w:val="num" w:pos="5760"/>
+        </w:tabs>
+        <w:ind w:left="5760" w:hanging="360"/>
+      </w:pPr>
+      <w:rPr>
+        <w:rFonts w:ascii="Wingdings" w:hAnsi="Wingdings" w:hint="default"/>
+        <w:sz w:val="20"/>
+      </w:rPr>
+    </w:lvl>
+    <w:lvl w:ilvl="8" w:tentative="1">
+      <w:start w:val="1"/>
+      <w:numFmt w:val="bullet"/>
+      <w:lvlText w:val=""/>
+      <w:lvlJc w:val="left"/>
+      <w:pPr>
+        <w:tabs>
+          <w:tab w:val="num" w:pos="6480"/>
+        </w:tabs>
+        <w:ind w:left="6480" w:hanging="360"/>
+      </w:pPr>
+      <w:rPr>
+        <w:rFonts w:ascii="Wingdings" w:hAnsi="Wingdings" w:hint="default"/>
+        <w:sz w:val="20"/>
+      </w:rPr>
+    </w:lvl>
+  </w:abstractNum>
+  <w:abstractNum w:abstractNumId="19" w15:restartNumberingAfterBreak="0">
+    <w:nsid w:val="4F3B4220"/>
+    <w:multiLevelType w:val="multilevel"/>
+    <w:tmpl w:val="F2D6884C"/>
+    <w:lvl w:ilvl="0">
+      <w:start w:val="1"/>
+      <w:numFmt w:val="bullet"/>
+      <w:lvlText w:val=""/>
+      <w:lvlJc w:val="left"/>
+      <w:pPr>
+        <w:tabs>
+          <w:tab w:val="num" w:pos="720"/>
+        </w:tabs>
+        <w:ind w:left="720" w:hanging="360"/>
+      </w:pPr>
+      <w:rPr>
+        <w:rFonts w:ascii="Symbol" w:hAnsi="Symbol" w:hint="default"/>
+        <w:sz w:val="20"/>
+      </w:rPr>
+    </w:lvl>
+    <w:lvl w:ilvl="1" w:tentative="1">
+      <w:start w:val="1"/>
+      <w:numFmt w:val="bullet"/>
+      <w:lvlText w:val="o"/>
+      <w:lvlJc w:val="left"/>
+      <w:pPr>
+        <w:tabs>
+          <w:tab w:val="num" w:pos="1440"/>
+        </w:tabs>
+        <w:ind w:left="1440" w:hanging="360"/>
+      </w:pPr>
+      <w:rPr>
+        <w:rFonts w:ascii="Courier New" w:hAnsi="Courier New" w:hint="default"/>
+        <w:sz w:val="20"/>
+      </w:rPr>
+    </w:lvl>
+    <w:lvl w:ilvl="2" w:tentative="1">
+      <w:start w:val="1"/>
+      <w:numFmt w:val="bullet"/>
+      <w:lvlText w:val=""/>
+      <w:lvlJc w:val="left"/>
+      <w:pPr>
+        <w:tabs>
+          <w:tab w:val="num" w:pos="2160"/>
+        </w:tabs>
+        <w:ind w:left="2160" w:hanging="360"/>
+      </w:pPr>
+      <w:rPr>
+        <w:rFonts w:ascii="Wingdings" w:hAnsi="Wingdings" w:hint="default"/>
+        <w:sz w:val="20"/>
+      </w:rPr>
+    </w:lvl>
+    <w:lvl w:ilvl="3" w:tentative="1">
+      <w:start w:val="1"/>
+      <w:numFmt w:val="bullet"/>
+      <w:lvlText w:val=""/>
+      <w:lvlJc w:val="left"/>
+      <w:pPr>
+        <w:tabs>
+          <w:tab w:val="num" w:pos="2880"/>
+        </w:tabs>
+        <w:ind w:left="2880" w:hanging="360"/>
+      </w:pPr>
+      <w:rPr>
+        <w:rFonts w:ascii="Wingdings" w:hAnsi="Wingdings" w:hint="default"/>
+        <w:sz w:val="20"/>
+      </w:rPr>
+    </w:lvl>
+    <w:lvl w:ilvl="4" w:tentative="1">
+      <w:start w:val="1"/>
+      <w:numFmt w:val="bullet"/>
+      <w:lvlText w:val=""/>
+      <w:lvlJc w:val="left"/>
+      <w:pPr>
+        <w:tabs>
+          <w:tab w:val="num" w:pos="3600"/>
+        </w:tabs>
+        <w:ind w:left="3600" w:hanging="360"/>
+      </w:pPr>
+      <w:rPr>
+        <w:rFonts w:ascii="Wingdings" w:hAnsi="Wingdings" w:hint="default"/>
+        <w:sz w:val="20"/>
+      </w:rPr>
+    </w:lvl>
+    <w:lvl w:ilvl="5" w:tentative="1">
+      <w:start w:val="1"/>
+      <w:numFmt w:val="bullet"/>
+      <w:lvlText w:val=""/>
+      <w:lvlJc w:val="left"/>
+      <w:pPr>
+        <w:tabs>
+          <w:tab w:val="num" w:pos="4320"/>
+        </w:tabs>
+        <w:ind w:left="4320" w:hanging="360"/>
+      </w:pPr>
+      <w:rPr>
+        <w:rFonts w:ascii="Wingdings" w:hAnsi="Wingdings" w:hint="default"/>
+        <w:sz w:val="20"/>
+      </w:rPr>
+    </w:lvl>
+    <w:lvl w:ilvl="6" w:tentative="1">
+      <w:start w:val="1"/>
+      <w:numFmt w:val="bullet"/>
+      <w:lvlText w:val=""/>
+      <w:lvlJc w:val="left"/>
+      <w:pPr>
+        <w:tabs>
+          <w:tab w:val="num" w:pos="5040"/>
+        </w:tabs>
+        <w:ind w:left="5040" w:hanging="360"/>
+      </w:pPr>
+      <w:rPr>
+        <w:rFonts w:ascii="Wingdings" w:hAnsi="Wingdings" w:hint="default"/>
+        <w:sz w:val="20"/>
+      </w:rPr>
+    </w:lvl>
+    <w:lvl w:ilvl="7" w:tentative="1">
+      <w:start w:val="1"/>
+      <w:numFmt w:val="bullet"/>
+      <w:lvlText w:val=""/>
+      <w:lvlJc w:val="left"/>
+      <w:pPr>
+        <w:tabs>
+          <w:tab w:val="num" w:pos="5760"/>
+        </w:tabs>
+        <w:ind w:left="5760" w:hanging="360"/>
+      </w:pPr>
+      <w:rPr>
+        <w:rFonts w:ascii="Wingdings" w:hAnsi="Wingdings" w:hint="default"/>
+        <w:sz w:val="20"/>
+      </w:rPr>
+    </w:lvl>
+    <w:lvl w:ilvl="8" w:tentative="1">
+      <w:start w:val="1"/>
+      <w:numFmt w:val="bullet"/>
+      <w:lvlText w:val=""/>
+      <w:lvlJc w:val="left"/>
+      <w:pPr>
+        <w:tabs>
+          <w:tab w:val="num" w:pos="6480"/>
+        </w:tabs>
+        <w:ind w:left="6480" w:hanging="360"/>
+      </w:pPr>
+      <w:rPr>
+        <w:rFonts w:ascii="Wingdings" w:hAnsi="Wingdings" w:hint="default"/>
+        <w:sz w:val="20"/>
+      </w:rPr>
+    </w:lvl>
+  </w:abstractNum>
+  <w:abstractNum w:abstractNumId="20" w15:restartNumberingAfterBreak="0">
     <w:nsid w:val="53FE6C68"/>
     <w:multiLevelType w:val="multilevel"/>
     <w:tmpl w:val="672A192A"/>
@@ -3721,7 +6783,305 @@
       </w:rPr>
     </w:lvl>
   </w:abstractNum>
-  <w:abstractNum w:abstractNumId="10" w15:restartNumberingAfterBreak="0">
+  <w:abstractNum w:abstractNumId="21" w15:restartNumberingAfterBreak="0">
+    <w:nsid w:val="54EC2D48"/>
+    <w:multiLevelType w:val="multilevel"/>
+    <w:tmpl w:val="C926457E"/>
+    <w:lvl w:ilvl="0">
+      <w:start w:val="1"/>
+      <w:numFmt w:val="bullet"/>
+      <w:lvlText w:val=""/>
+      <w:lvlJc w:val="left"/>
+      <w:pPr>
+        <w:tabs>
+          <w:tab w:val="num" w:pos="720"/>
+        </w:tabs>
+        <w:ind w:left="720" w:hanging="360"/>
+      </w:pPr>
+      <w:rPr>
+        <w:rFonts w:ascii="Symbol" w:hAnsi="Symbol" w:hint="default"/>
+        <w:sz w:val="20"/>
+      </w:rPr>
+    </w:lvl>
+    <w:lvl w:ilvl="1" w:tentative="1">
+      <w:start w:val="1"/>
+      <w:numFmt w:val="bullet"/>
+      <w:lvlText w:val="o"/>
+      <w:lvlJc w:val="left"/>
+      <w:pPr>
+        <w:tabs>
+          <w:tab w:val="num" w:pos="1440"/>
+        </w:tabs>
+        <w:ind w:left="1440" w:hanging="360"/>
+      </w:pPr>
+      <w:rPr>
+        <w:rFonts w:ascii="Courier New" w:hAnsi="Courier New" w:hint="default"/>
+        <w:sz w:val="20"/>
+      </w:rPr>
+    </w:lvl>
+    <w:lvl w:ilvl="2" w:tentative="1">
+      <w:start w:val="1"/>
+      <w:numFmt w:val="bullet"/>
+      <w:lvlText w:val=""/>
+      <w:lvlJc w:val="left"/>
+      <w:pPr>
+        <w:tabs>
+          <w:tab w:val="num" w:pos="2160"/>
+        </w:tabs>
+        <w:ind w:left="2160" w:hanging="360"/>
+      </w:pPr>
+      <w:rPr>
+        <w:rFonts w:ascii="Wingdings" w:hAnsi="Wingdings" w:hint="default"/>
+        <w:sz w:val="20"/>
+      </w:rPr>
+    </w:lvl>
+    <w:lvl w:ilvl="3" w:tentative="1">
+      <w:start w:val="1"/>
+      <w:numFmt w:val="bullet"/>
+      <w:lvlText w:val=""/>
+      <w:lvlJc w:val="left"/>
+      <w:pPr>
+        <w:tabs>
+          <w:tab w:val="num" w:pos="2880"/>
+        </w:tabs>
+        <w:ind w:left="2880" w:hanging="360"/>
+      </w:pPr>
+      <w:rPr>
+        <w:rFonts w:ascii="Wingdings" w:hAnsi="Wingdings" w:hint="default"/>
+        <w:sz w:val="20"/>
+      </w:rPr>
+    </w:lvl>
+    <w:lvl w:ilvl="4" w:tentative="1">
+      <w:start w:val="1"/>
+      <w:numFmt w:val="bullet"/>
+      <w:lvlText w:val=""/>
+      <w:lvlJc w:val="left"/>
+      <w:pPr>
+        <w:tabs>
+          <w:tab w:val="num" w:pos="3600"/>
+        </w:tabs>
+        <w:ind w:left="3600" w:hanging="360"/>
+      </w:pPr>
+      <w:rPr>
+        <w:rFonts w:ascii="Wingdings" w:hAnsi="Wingdings" w:hint="default"/>
+        <w:sz w:val="20"/>
+      </w:rPr>
+    </w:lvl>
+    <w:lvl w:ilvl="5" w:tentative="1">
+      <w:start w:val="1"/>
+      <w:numFmt w:val="bullet"/>
+      <w:lvlText w:val=""/>
+      <w:lvlJc w:val="left"/>
+      <w:pPr>
+        <w:tabs>
+          <w:tab w:val="num" w:pos="4320"/>
+        </w:tabs>
+        <w:ind w:left="4320" w:hanging="360"/>
+      </w:pPr>
+      <w:rPr>
+        <w:rFonts w:ascii="Wingdings" w:hAnsi="Wingdings" w:hint="default"/>
+        <w:sz w:val="20"/>
+      </w:rPr>
+    </w:lvl>
+    <w:lvl w:ilvl="6" w:tentative="1">
+      <w:start w:val="1"/>
+      <w:numFmt w:val="bullet"/>
+      <w:lvlText w:val=""/>
+      <w:lvlJc w:val="left"/>
+      <w:pPr>
+        <w:tabs>
+          <w:tab w:val="num" w:pos="5040"/>
+        </w:tabs>
+        <w:ind w:left="5040" w:hanging="360"/>
+      </w:pPr>
+      <w:rPr>
+        <w:rFonts w:ascii="Wingdings" w:hAnsi="Wingdings" w:hint="default"/>
+        <w:sz w:val="20"/>
+      </w:rPr>
+    </w:lvl>
+    <w:lvl w:ilvl="7" w:tentative="1">
+      <w:start w:val="1"/>
+      <w:numFmt w:val="bullet"/>
+      <w:lvlText w:val=""/>
+      <w:lvlJc w:val="left"/>
+      <w:pPr>
+        <w:tabs>
+          <w:tab w:val="num" w:pos="5760"/>
+        </w:tabs>
+        <w:ind w:left="5760" w:hanging="360"/>
+      </w:pPr>
+      <w:rPr>
+        <w:rFonts w:ascii="Wingdings" w:hAnsi="Wingdings" w:hint="default"/>
+        <w:sz w:val="20"/>
+      </w:rPr>
+    </w:lvl>
+    <w:lvl w:ilvl="8" w:tentative="1">
+      <w:start w:val="1"/>
+      <w:numFmt w:val="bullet"/>
+      <w:lvlText w:val=""/>
+      <w:lvlJc w:val="left"/>
+      <w:pPr>
+        <w:tabs>
+          <w:tab w:val="num" w:pos="6480"/>
+        </w:tabs>
+        <w:ind w:left="6480" w:hanging="360"/>
+      </w:pPr>
+      <w:rPr>
+        <w:rFonts w:ascii="Wingdings" w:hAnsi="Wingdings" w:hint="default"/>
+        <w:sz w:val="20"/>
+      </w:rPr>
+    </w:lvl>
+  </w:abstractNum>
+  <w:abstractNum w:abstractNumId="22" w15:restartNumberingAfterBreak="0">
+    <w:nsid w:val="54F16D74"/>
+    <w:multiLevelType w:val="multilevel"/>
+    <w:tmpl w:val="740E9F88"/>
+    <w:lvl w:ilvl="0">
+      <w:start w:val="1"/>
+      <w:numFmt w:val="bullet"/>
+      <w:lvlText w:val=""/>
+      <w:lvlJc w:val="left"/>
+      <w:pPr>
+        <w:tabs>
+          <w:tab w:val="num" w:pos="720"/>
+        </w:tabs>
+        <w:ind w:left="720" w:hanging="360"/>
+      </w:pPr>
+      <w:rPr>
+        <w:rFonts w:ascii="Symbol" w:hAnsi="Symbol" w:hint="default"/>
+        <w:sz w:val="20"/>
+      </w:rPr>
+    </w:lvl>
+    <w:lvl w:ilvl="1" w:tentative="1">
+      <w:start w:val="1"/>
+      <w:numFmt w:val="bullet"/>
+      <w:lvlText w:val="o"/>
+      <w:lvlJc w:val="left"/>
+      <w:pPr>
+        <w:tabs>
+          <w:tab w:val="num" w:pos="1440"/>
+        </w:tabs>
+        <w:ind w:left="1440" w:hanging="360"/>
+      </w:pPr>
+      <w:rPr>
+        <w:rFonts w:ascii="Courier New" w:hAnsi="Courier New" w:hint="default"/>
+        <w:sz w:val="20"/>
+      </w:rPr>
+    </w:lvl>
+    <w:lvl w:ilvl="2" w:tentative="1">
+      <w:start w:val="1"/>
+      <w:numFmt w:val="bullet"/>
+      <w:lvlText w:val=""/>
+      <w:lvlJc w:val="left"/>
+      <w:pPr>
+        <w:tabs>
+          <w:tab w:val="num" w:pos="2160"/>
+        </w:tabs>
+        <w:ind w:left="2160" w:hanging="360"/>
+      </w:pPr>
+      <w:rPr>
+        <w:rFonts w:ascii="Wingdings" w:hAnsi="Wingdings" w:hint="default"/>
+        <w:sz w:val="20"/>
+      </w:rPr>
+    </w:lvl>
+    <w:lvl w:ilvl="3" w:tentative="1">
+      <w:start w:val="1"/>
+      <w:numFmt w:val="bullet"/>
+      <w:lvlText w:val=""/>
+      <w:lvlJc w:val="left"/>
+      <w:pPr>
+        <w:tabs>
+          <w:tab w:val="num" w:pos="2880"/>
+        </w:tabs>
+        <w:ind w:left="2880" w:hanging="360"/>
+      </w:pPr>
+      <w:rPr>
+        <w:rFonts w:ascii="Wingdings" w:hAnsi="Wingdings" w:hint="default"/>
+        <w:sz w:val="20"/>
+      </w:rPr>
+    </w:lvl>
+    <w:lvl w:ilvl="4" w:tentative="1">
+      <w:start w:val="1"/>
+      <w:numFmt w:val="bullet"/>
+      <w:lvlText w:val=""/>
+      <w:lvlJc w:val="left"/>
+      <w:pPr>
+        <w:tabs>
+          <w:tab w:val="num" w:pos="3600"/>
+        </w:tabs>
+        <w:ind w:left="3600" w:hanging="360"/>
+      </w:pPr>
+      <w:rPr>
+        <w:rFonts w:ascii="Wingdings" w:hAnsi="Wingdings" w:hint="default"/>
+        <w:sz w:val="20"/>
+      </w:rPr>
+    </w:lvl>
+    <w:lvl w:ilvl="5" w:tentative="1">
+      <w:start w:val="1"/>
+      <w:numFmt w:val="bullet"/>
+      <w:lvlText w:val=""/>
+      <w:lvlJc w:val="left"/>
+      <w:pPr>
+        <w:tabs>
+          <w:tab w:val="num" w:pos="4320"/>
+        </w:tabs>
+        <w:ind w:left="4320" w:hanging="360"/>
+      </w:pPr>
+      <w:rPr>
+        <w:rFonts w:ascii="Wingdings" w:hAnsi="Wingdings" w:hint="default"/>
+        <w:sz w:val="20"/>
+      </w:rPr>
+    </w:lvl>
+    <w:lvl w:ilvl="6" w:tentative="1">
+      <w:start w:val="1"/>
+      <w:numFmt w:val="bullet"/>
+      <w:lvlText w:val=""/>
+      <w:lvlJc w:val="left"/>
+      <w:pPr>
+        <w:tabs>
+          <w:tab w:val="num" w:pos="5040"/>
+        </w:tabs>
+        <w:ind w:left="5040" w:hanging="360"/>
+      </w:pPr>
+      <w:rPr>
+        <w:rFonts w:ascii="Wingdings" w:hAnsi="Wingdings" w:hint="default"/>
+        <w:sz w:val="20"/>
+      </w:rPr>
+    </w:lvl>
+    <w:lvl w:ilvl="7" w:tentative="1">
+      <w:start w:val="1"/>
+      <w:numFmt w:val="bullet"/>
+      <w:lvlText w:val=""/>
+      <w:lvlJc w:val="left"/>
+      <w:pPr>
+        <w:tabs>
+          <w:tab w:val="num" w:pos="5760"/>
+        </w:tabs>
+        <w:ind w:left="5760" w:hanging="360"/>
+      </w:pPr>
+      <w:rPr>
+        <w:rFonts w:ascii="Wingdings" w:hAnsi="Wingdings" w:hint="default"/>
+        <w:sz w:val="20"/>
+      </w:rPr>
+    </w:lvl>
+    <w:lvl w:ilvl="8" w:tentative="1">
+      <w:start w:val="1"/>
+      <w:numFmt w:val="bullet"/>
+      <w:lvlText w:val=""/>
+      <w:lvlJc w:val="left"/>
+      <w:pPr>
+        <w:tabs>
+          <w:tab w:val="num" w:pos="6480"/>
+        </w:tabs>
+        <w:ind w:left="6480" w:hanging="360"/>
+      </w:pPr>
+      <w:rPr>
+        <w:rFonts w:ascii="Wingdings" w:hAnsi="Wingdings" w:hint="default"/>
+        <w:sz w:val="20"/>
+      </w:rPr>
+    </w:lvl>
+  </w:abstractNum>
+  <w:abstractNum w:abstractNumId="23" w15:restartNumberingAfterBreak="0">
     <w:nsid w:val="56955772"/>
     <w:multiLevelType w:val="multilevel"/>
     <w:tmpl w:val="E7BEE8CC"/>
@@ -3870,7 +7230,454 @@
       </w:rPr>
     </w:lvl>
   </w:abstractNum>
-  <w:abstractNum w:abstractNumId="11" w15:restartNumberingAfterBreak="0">
+  <w:abstractNum w:abstractNumId="24" w15:restartNumberingAfterBreak="0">
+    <w:nsid w:val="59803C2E"/>
+    <w:multiLevelType w:val="multilevel"/>
+    <w:tmpl w:val="E6003144"/>
+    <w:lvl w:ilvl="0">
+      <w:start w:val="1"/>
+      <w:numFmt w:val="bullet"/>
+      <w:lvlText w:val=""/>
+      <w:lvlJc w:val="left"/>
+      <w:pPr>
+        <w:tabs>
+          <w:tab w:val="num" w:pos="720"/>
+        </w:tabs>
+        <w:ind w:left="720" w:hanging="360"/>
+      </w:pPr>
+      <w:rPr>
+        <w:rFonts w:ascii="Symbol" w:hAnsi="Symbol" w:hint="default"/>
+        <w:sz w:val="20"/>
+      </w:rPr>
+    </w:lvl>
+    <w:lvl w:ilvl="1" w:tentative="1">
+      <w:start w:val="1"/>
+      <w:numFmt w:val="bullet"/>
+      <w:lvlText w:val="o"/>
+      <w:lvlJc w:val="left"/>
+      <w:pPr>
+        <w:tabs>
+          <w:tab w:val="num" w:pos="1440"/>
+        </w:tabs>
+        <w:ind w:left="1440" w:hanging="360"/>
+      </w:pPr>
+      <w:rPr>
+        <w:rFonts w:ascii="Courier New" w:hAnsi="Courier New" w:hint="default"/>
+        <w:sz w:val="20"/>
+      </w:rPr>
+    </w:lvl>
+    <w:lvl w:ilvl="2" w:tentative="1">
+      <w:start w:val="1"/>
+      <w:numFmt w:val="bullet"/>
+      <w:lvlText w:val=""/>
+      <w:lvlJc w:val="left"/>
+      <w:pPr>
+        <w:tabs>
+          <w:tab w:val="num" w:pos="2160"/>
+        </w:tabs>
+        <w:ind w:left="2160" w:hanging="360"/>
+      </w:pPr>
+      <w:rPr>
+        <w:rFonts w:ascii="Wingdings" w:hAnsi="Wingdings" w:hint="default"/>
+        <w:sz w:val="20"/>
+      </w:rPr>
+    </w:lvl>
+    <w:lvl w:ilvl="3" w:tentative="1">
+      <w:start w:val="1"/>
+      <w:numFmt w:val="bullet"/>
+      <w:lvlText w:val=""/>
+      <w:lvlJc w:val="left"/>
+      <w:pPr>
+        <w:tabs>
+          <w:tab w:val="num" w:pos="2880"/>
+        </w:tabs>
+        <w:ind w:left="2880" w:hanging="360"/>
+      </w:pPr>
+      <w:rPr>
+        <w:rFonts w:ascii="Wingdings" w:hAnsi="Wingdings" w:hint="default"/>
+        <w:sz w:val="20"/>
+      </w:rPr>
+    </w:lvl>
+    <w:lvl w:ilvl="4" w:tentative="1">
+      <w:start w:val="1"/>
+      <w:numFmt w:val="bullet"/>
+      <w:lvlText w:val=""/>
+      <w:lvlJc w:val="left"/>
+      <w:pPr>
+        <w:tabs>
+          <w:tab w:val="num" w:pos="3600"/>
+        </w:tabs>
+        <w:ind w:left="3600" w:hanging="360"/>
+      </w:pPr>
+      <w:rPr>
+        <w:rFonts w:ascii="Wingdings" w:hAnsi="Wingdings" w:hint="default"/>
+        <w:sz w:val="20"/>
+      </w:rPr>
+    </w:lvl>
+    <w:lvl w:ilvl="5" w:tentative="1">
+      <w:start w:val="1"/>
+      <w:numFmt w:val="bullet"/>
+      <w:lvlText w:val=""/>
+      <w:lvlJc w:val="left"/>
+      <w:pPr>
+        <w:tabs>
+          <w:tab w:val="num" w:pos="4320"/>
+        </w:tabs>
+        <w:ind w:left="4320" w:hanging="360"/>
+      </w:pPr>
+      <w:rPr>
+        <w:rFonts w:ascii="Wingdings" w:hAnsi="Wingdings" w:hint="default"/>
+        <w:sz w:val="20"/>
+      </w:rPr>
+    </w:lvl>
+    <w:lvl w:ilvl="6" w:tentative="1">
+      <w:start w:val="1"/>
+      <w:numFmt w:val="bullet"/>
+      <w:lvlText w:val=""/>
+      <w:lvlJc w:val="left"/>
+      <w:pPr>
+        <w:tabs>
+          <w:tab w:val="num" w:pos="5040"/>
+        </w:tabs>
+        <w:ind w:left="5040" w:hanging="360"/>
+      </w:pPr>
+      <w:rPr>
+        <w:rFonts w:ascii="Wingdings" w:hAnsi="Wingdings" w:hint="default"/>
+        <w:sz w:val="20"/>
+      </w:rPr>
+    </w:lvl>
+    <w:lvl w:ilvl="7" w:tentative="1">
+      <w:start w:val="1"/>
+      <w:numFmt w:val="bullet"/>
+      <w:lvlText w:val=""/>
+      <w:lvlJc w:val="left"/>
+      <w:pPr>
+        <w:tabs>
+          <w:tab w:val="num" w:pos="5760"/>
+        </w:tabs>
+        <w:ind w:left="5760" w:hanging="360"/>
+      </w:pPr>
+      <w:rPr>
+        <w:rFonts w:ascii="Wingdings" w:hAnsi="Wingdings" w:hint="default"/>
+        <w:sz w:val="20"/>
+      </w:rPr>
+    </w:lvl>
+    <w:lvl w:ilvl="8" w:tentative="1">
+      <w:start w:val="1"/>
+      <w:numFmt w:val="bullet"/>
+      <w:lvlText w:val=""/>
+      <w:lvlJc w:val="left"/>
+      <w:pPr>
+        <w:tabs>
+          <w:tab w:val="num" w:pos="6480"/>
+        </w:tabs>
+        <w:ind w:left="6480" w:hanging="360"/>
+      </w:pPr>
+      <w:rPr>
+        <w:rFonts w:ascii="Wingdings" w:hAnsi="Wingdings" w:hint="default"/>
+        <w:sz w:val="20"/>
+      </w:rPr>
+    </w:lvl>
+  </w:abstractNum>
+  <w:abstractNum w:abstractNumId="25" w15:restartNumberingAfterBreak="0">
+    <w:nsid w:val="59DC0F53"/>
+    <w:multiLevelType w:val="multilevel"/>
+    <w:tmpl w:val="1758F726"/>
+    <w:lvl w:ilvl="0">
+      <w:start w:val="1"/>
+      <w:numFmt w:val="bullet"/>
+      <w:lvlText w:val=""/>
+      <w:lvlJc w:val="left"/>
+      <w:pPr>
+        <w:tabs>
+          <w:tab w:val="num" w:pos="720"/>
+        </w:tabs>
+        <w:ind w:left="720" w:hanging="360"/>
+      </w:pPr>
+      <w:rPr>
+        <w:rFonts w:ascii="Symbol" w:hAnsi="Symbol" w:hint="default"/>
+        <w:sz w:val="20"/>
+      </w:rPr>
+    </w:lvl>
+    <w:lvl w:ilvl="1" w:tentative="1">
+      <w:start w:val="1"/>
+      <w:numFmt w:val="bullet"/>
+      <w:lvlText w:val="o"/>
+      <w:lvlJc w:val="left"/>
+      <w:pPr>
+        <w:tabs>
+          <w:tab w:val="num" w:pos="1440"/>
+        </w:tabs>
+        <w:ind w:left="1440" w:hanging="360"/>
+      </w:pPr>
+      <w:rPr>
+        <w:rFonts w:ascii="Courier New" w:hAnsi="Courier New" w:hint="default"/>
+        <w:sz w:val="20"/>
+      </w:rPr>
+    </w:lvl>
+    <w:lvl w:ilvl="2" w:tentative="1">
+      <w:start w:val="1"/>
+      <w:numFmt w:val="bullet"/>
+      <w:lvlText w:val=""/>
+      <w:lvlJc w:val="left"/>
+      <w:pPr>
+        <w:tabs>
+          <w:tab w:val="num" w:pos="2160"/>
+        </w:tabs>
+        <w:ind w:left="2160" w:hanging="360"/>
+      </w:pPr>
+      <w:rPr>
+        <w:rFonts w:ascii="Wingdings" w:hAnsi="Wingdings" w:hint="default"/>
+        <w:sz w:val="20"/>
+      </w:rPr>
+    </w:lvl>
+    <w:lvl w:ilvl="3" w:tentative="1">
+      <w:start w:val="1"/>
+      <w:numFmt w:val="bullet"/>
+      <w:lvlText w:val=""/>
+      <w:lvlJc w:val="left"/>
+      <w:pPr>
+        <w:tabs>
+          <w:tab w:val="num" w:pos="2880"/>
+        </w:tabs>
+        <w:ind w:left="2880" w:hanging="360"/>
+      </w:pPr>
+      <w:rPr>
+        <w:rFonts w:ascii="Wingdings" w:hAnsi="Wingdings" w:hint="default"/>
+        <w:sz w:val="20"/>
+      </w:rPr>
+    </w:lvl>
+    <w:lvl w:ilvl="4" w:tentative="1">
+      <w:start w:val="1"/>
+      <w:numFmt w:val="bullet"/>
+      <w:lvlText w:val=""/>
+      <w:lvlJc w:val="left"/>
+      <w:pPr>
+        <w:tabs>
+          <w:tab w:val="num" w:pos="3600"/>
+        </w:tabs>
+        <w:ind w:left="3600" w:hanging="360"/>
+      </w:pPr>
+      <w:rPr>
+        <w:rFonts w:ascii="Wingdings" w:hAnsi="Wingdings" w:hint="default"/>
+        <w:sz w:val="20"/>
+      </w:rPr>
+    </w:lvl>
+    <w:lvl w:ilvl="5" w:tentative="1">
+      <w:start w:val="1"/>
+      <w:numFmt w:val="bullet"/>
+      <w:lvlText w:val=""/>
+      <w:lvlJc w:val="left"/>
+      <w:pPr>
+        <w:tabs>
+          <w:tab w:val="num" w:pos="4320"/>
+        </w:tabs>
+        <w:ind w:left="4320" w:hanging="360"/>
+      </w:pPr>
+      <w:rPr>
+        <w:rFonts w:ascii="Wingdings" w:hAnsi="Wingdings" w:hint="default"/>
+        <w:sz w:val="20"/>
+      </w:rPr>
+    </w:lvl>
+    <w:lvl w:ilvl="6" w:tentative="1">
+      <w:start w:val="1"/>
+      <w:numFmt w:val="bullet"/>
+      <w:lvlText w:val=""/>
+      <w:lvlJc w:val="left"/>
+      <w:pPr>
+        <w:tabs>
+          <w:tab w:val="num" w:pos="5040"/>
+        </w:tabs>
+        <w:ind w:left="5040" w:hanging="360"/>
+      </w:pPr>
+      <w:rPr>
+        <w:rFonts w:ascii="Wingdings" w:hAnsi="Wingdings" w:hint="default"/>
+        <w:sz w:val="20"/>
+      </w:rPr>
+    </w:lvl>
+    <w:lvl w:ilvl="7" w:tentative="1">
+      <w:start w:val="1"/>
+      <w:numFmt w:val="bullet"/>
+      <w:lvlText w:val=""/>
+      <w:lvlJc w:val="left"/>
+      <w:pPr>
+        <w:tabs>
+          <w:tab w:val="num" w:pos="5760"/>
+        </w:tabs>
+        <w:ind w:left="5760" w:hanging="360"/>
+      </w:pPr>
+      <w:rPr>
+        <w:rFonts w:ascii="Wingdings" w:hAnsi="Wingdings" w:hint="default"/>
+        <w:sz w:val="20"/>
+      </w:rPr>
+    </w:lvl>
+    <w:lvl w:ilvl="8" w:tentative="1">
+      <w:start w:val="1"/>
+      <w:numFmt w:val="bullet"/>
+      <w:lvlText w:val=""/>
+      <w:lvlJc w:val="left"/>
+      <w:pPr>
+        <w:tabs>
+          <w:tab w:val="num" w:pos="6480"/>
+        </w:tabs>
+        <w:ind w:left="6480" w:hanging="360"/>
+      </w:pPr>
+      <w:rPr>
+        <w:rFonts w:ascii="Wingdings" w:hAnsi="Wingdings" w:hint="default"/>
+        <w:sz w:val="20"/>
+      </w:rPr>
+    </w:lvl>
+  </w:abstractNum>
+  <w:abstractNum w:abstractNumId="26" w15:restartNumberingAfterBreak="0">
+    <w:nsid w:val="5AA11FF1"/>
+    <w:multiLevelType w:val="multilevel"/>
+    <w:tmpl w:val="3222BA62"/>
+    <w:lvl w:ilvl="0">
+      <w:start w:val="1"/>
+      <w:numFmt w:val="bullet"/>
+      <w:lvlText w:val=""/>
+      <w:lvlJc w:val="left"/>
+      <w:pPr>
+        <w:tabs>
+          <w:tab w:val="num" w:pos="720"/>
+        </w:tabs>
+        <w:ind w:left="720" w:hanging="360"/>
+      </w:pPr>
+      <w:rPr>
+        <w:rFonts w:ascii="Symbol" w:hAnsi="Symbol" w:hint="default"/>
+        <w:sz w:val="20"/>
+      </w:rPr>
+    </w:lvl>
+    <w:lvl w:ilvl="1" w:tentative="1">
+      <w:start w:val="1"/>
+      <w:numFmt w:val="bullet"/>
+      <w:lvlText w:val="o"/>
+      <w:lvlJc w:val="left"/>
+      <w:pPr>
+        <w:tabs>
+          <w:tab w:val="num" w:pos="1440"/>
+        </w:tabs>
+        <w:ind w:left="1440" w:hanging="360"/>
+      </w:pPr>
+      <w:rPr>
+        <w:rFonts w:ascii="Courier New" w:hAnsi="Courier New" w:hint="default"/>
+        <w:sz w:val="20"/>
+      </w:rPr>
+    </w:lvl>
+    <w:lvl w:ilvl="2" w:tentative="1">
+      <w:start w:val="1"/>
+      <w:numFmt w:val="bullet"/>
+      <w:lvlText w:val=""/>
+      <w:lvlJc w:val="left"/>
+      <w:pPr>
+        <w:tabs>
+          <w:tab w:val="num" w:pos="2160"/>
+        </w:tabs>
+        <w:ind w:left="2160" w:hanging="360"/>
+      </w:pPr>
+      <w:rPr>
+        <w:rFonts w:ascii="Wingdings" w:hAnsi="Wingdings" w:hint="default"/>
+        <w:sz w:val="20"/>
+      </w:rPr>
+    </w:lvl>
+    <w:lvl w:ilvl="3" w:tentative="1">
+      <w:start w:val="1"/>
+      <w:numFmt w:val="bullet"/>
+      <w:lvlText w:val=""/>
+      <w:lvlJc w:val="left"/>
+      <w:pPr>
+        <w:tabs>
+          <w:tab w:val="num" w:pos="2880"/>
+        </w:tabs>
+        <w:ind w:left="2880" w:hanging="360"/>
+      </w:pPr>
+      <w:rPr>
+        <w:rFonts w:ascii="Wingdings" w:hAnsi="Wingdings" w:hint="default"/>
+        <w:sz w:val="20"/>
+      </w:rPr>
+    </w:lvl>
+    <w:lvl w:ilvl="4" w:tentative="1">
+      <w:start w:val="1"/>
+      <w:numFmt w:val="bullet"/>
+      <w:lvlText w:val=""/>
+      <w:lvlJc w:val="left"/>
+      <w:pPr>
+        <w:tabs>
+          <w:tab w:val="num" w:pos="3600"/>
+        </w:tabs>
+        <w:ind w:left="3600" w:hanging="360"/>
+      </w:pPr>
+      <w:rPr>
+        <w:rFonts w:ascii="Wingdings" w:hAnsi="Wingdings" w:hint="default"/>
+        <w:sz w:val="20"/>
+      </w:rPr>
+    </w:lvl>
+    <w:lvl w:ilvl="5" w:tentative="1">
+      <w:start w:val="1"/>
+      <w:numFmt w:val="bullet"/>
+      <w:lvlText w:val=""/>
+      <w:lvlJc w:val="left"/>
+      <w:pPr>
+        <w:tabs>
+          <w:tab w:val="num" w:pos="4320"/>
+        </w:tabs>
+        <w:ind w:left="4320" w:hanging="360"/>
+      </w:pPr>
+      <w:rPr>
+        <w:rFonts w:ascii="Wingdings" w:hAnsi="Wingdings" w:hint="default"/>
+        <w:sz w:val="20"/>
+      </w:rPr>
+    </w:lvl>
+    <w:lvl w:ilvl="6" w:tentative="1">
+      <w:start w:val="1"/>
+      <w:numFmt w:val="bullet"/>
+      <w:lvlText w:val=""/>
+      <w:lvlJc w:val="left"/>
+      <w:pPr>
+        <w:tabs>
+          <w:tab w:val="num" w:pos="5040"/>
+        </w:tabs>
+        <w:ind w:left="5040" w:hanging="360"/>
+      </w:pPr>
+      <w:rPr>
+        <w:rFonts w:ascii="Wingdings" w:hAnsi="Wingdings" w:hint="default"/>
+        <w:sz w:val="20"/>
+      </w:rPr>
+    </w:lvl>
+    <w:lvl w:ilvl="7" w:tentative="1">
+      <w:start w:val="1"/>
+      <w:numFmt w:val="bullet"/>
+      <w:lvlText w:val=""/>
+      <w:lvlJc w:val="left"/>
+      <w:pPr>
+        <w:tabs>
+          <w:tab w:val="num" w:pos="5760"/>
+        </w:tabs>
+        <w:ind w:left="5760" w:hanging="360"/>
+      </w:pPr>
+      <w:rPr>
+        <w:rFonts w:ascii="Wingdings" w:hAnsi="Wingdings" w:hint="default"/>
+        <w:sz w:val="20"/>
+      </w:rPr>
+    </w:lvl>
+    <w:lvl w:ilvl="8" w:tentative="1">
+      <w:start w:val="1"/>
+      <w:numFmt w:val="bullet"/>
+      <w:lvlText w:val=""/>
+      <w:lvlJc w:val="left"/>
+      <w:pPr>
+        <w:tabs>
+          <w:tab w:val="num" w:pos="6480"/>
+        </w:tabs>
+        <w:ind w:left="6480" w:hanging="360"/>
+      </w:pPr>
+      <w:rPr>
+        <w:rFonts w:ascii="Wingdings" w:hAnsi="Wingdings" w:hint="default"/>
+        <w:sz w:val="20"/>
+      </w:rPr>
+    </w:lvl>
+  </w:abstractNum>
+  <w:abstractNum w:abstractNumId="27" w15:restartNumberingAfterBreak="0">
     <w:nsid w:val="5D3D2799"/>
     <w:multiLevelType w:val="multilevel"/>
     <w:tmpl w:val="C2DADC30"/>
@@ -4019,7 +7826,7 @@
       </w:rPr>
     </w:lvl>
   </w:abstractNum>
-  <w:abstractNum w:abstractNumId="12" w15:restartNumberingAfterBreak="0">
+  <w:abstractNum w:abstractNumId="28" w15:restartNumberingAfterBreak="0">
     <w:nsid w:val="5F841539"/>
     <w:multiLevelType w:val="multilevel"/>
     <w:tmpl w:val="B44EA356"/>
@@ -4168,7 +7975,7 @@
       </w:rPr>
     </w:lvl>
   </w:abstractNum>
-  <w:abstractNum w:abstractNumId="13" w15:restartNumberingAfterBreak="0">
+  <w:abstractNum w:abstractNumId="29" w15:restartNumberingAfterBreak="0">
     <w:nsid w:val="6B4C17E9"/>
     <w:multiLevelType w:val="multilevel"/>
     <w:tmpl w:val="10C22E7C"/>
@@ -4317,7 +8124,7 @@
       </w:rPr>
     </w:lvl>
   </w:abstractNum>
-  <w:abstractNum w:abstractNumId="14" w15:restartNumberingAfterBreak="0">
+  <w:abstractNum w:abstractNumId="30" w15:restartNumberingAfterBreak="0">
     <w:nsid w:val="6BFC7F95"/>
     <w:multiLevelType w:val="multilevel"/>
     <w:tmpl w:val="745C5754"/>
@@ -4466,7 +8273,7 @@
       </w:rPr>
     </w:lvl>
   </w:abstractNum>
-  <w:abstractNum w:abstractNumId="15" w15:restartNumberingAfterBreak="0">
+  <w:abstractNum w:abstractNumId="31" w15:restartNumberingAfterBreak="0">
     <w:nsid w:val="6C2339E7"/>
     <w:multiLevelType w:val="multilevel"/>
     <w:tmpl w:val="48B6D2EC"/>
@@ -4615,7 +8422,7 @@
       </w:rPr>
     </w:lvl>
   </w:abstractNum>
-  <w:abstractNum w:abstractNumId="16" w15:restartNumberingAfterBreak="0">
+  <w:abstractNum w:abstractNumId="32" w15:restartNumberingAfterBreak="0">
     <w:nsid w:val="6C541F3D"/>
     <w:multiLevelType w:val="multilevel"/>
     <w:tmpl w:val="2D92B78E"/>
@@ -4764,7 +8571,7 @@
       </w:rPr>
     </w:lvl>
   </w:abstractNum>
-  <w:abstractNum w:abstractNumId="17" w15:restartNumberingAfterBreak="0">
+  <w:abstractNum w:abstractNumId="33" w15:restartNumberingAfterBreak="0">
     <w:nsid w:val="71533C2D"/>
     <w:multiLevelType w:val="multilevel"/>
     <w:tmpl w:val="B5309DD4"/>
@@ -4913,7 +8720,305 @@
       </w:rPr>
     </w:lvl>
   </w:abstractNum>
-  <w:abstractNum w:abstractNumId="18" w15:restartNumberingAfterBreak="0">
+  <w:abstractNum w:abstractNumId="34" w15:restartNumberingAfterBreak="0">
+    <w:nsid w:val="747A4D69"/>
+    <w:multiLevelType w:val="multilevel"/>
+    <w:tmpl w:val="D7C43832"/>
+    <w:lvl w:ilvl="0">
+      <w:start w:val="1"/>
+      <w:numFmt w:val="bullet"/>
+      <w:lvlText w:val=""/>
+      <w:lvlJc w:val="left"/>
+      <w:pPr>
+        <w:tabs>
+          <w:tab w:val="num" w:pos="720"/>
+        </w:tabs>
+        <w:ind w:left="720" w:hanging="360"/>
+      </w:pPr>
+      <w:rPr>
+        <w:rFonts w:ascii="Symbol" w:hAnsi="Symbol" w:hint="default"/>
+        <w:sz w:val="20"/>
+      </w:rPr>
+    </w:lvl>
+    <w:lvl w:ilvl="1" w:tentative="1">
+      <w:start w:val="1"/>
+      <w:numFmt w:val="bullet"/>
+      <w:lvlText w:val="o"/>
+      <w:lvlJc w:val="left"/>
+      <w:pPr>
+        <w:tabs>
+          <w:tab w:val="num" w:pos="1440"/>
+        </w:tabs>
+        <w:ind w:left="1440" w:hanging="360"/>
+      </w:pPr>
+      <w:rPr>
+        <w:rFonts w:ascii="Courier New" w:hAnsi="Courier New" w:hint="default"/>
+        <w:sz w:val="20"/>
+      </w:rPr>
+    </w:lvl>
+    <w:lvl w:ilvl="2" w:tentative="1">
+      <w:start w:val="1"/>
+      <w:numFmt w:val="bullet"/>
+      <w:lvlText w:val=""/>
+      <w:lvlJc w:val="left"/>
+      <w:pPr>
+        <w:tabs>
+          <w:tab w:val="num" w:pos="2160"/>
+        </w:tabs>
+        <w:ind w:left="2160" w:hanging="360"/>
+      </w:pPr>
+      <w:rPr>
+        <w:rFonts w:ascii="Wingdings" w:hAnsi="Wingdings" w:hint="default"/>
+        <w:sz w:val="20"/>
+      </w:rPr>
+    </w:lvl>
+    <w:lvl w:ilvl="3" w:tentative="1">
+      <w:start w:val="1"/>
+      <w:numFmt w:val="bullet"/>
+      <w:lvlText w:val=""/>
+      <w:lvlJc w:val="left"/>
+      <w:pPr>
+        <w:tabs>
+          <w:tab w:val="num" w:pos="2880"/>
+        </w:tabs>
+        <w:ind w:left="2880" w:hanging="360"/>
+      </w:pPr>
+      <w:rPr>
+        <w:rFonts w:ascii="Wingdings" w:hAnsi="Wingdings" w:hint="default"/>
+        <w:sz w:val="20"/>
+      </w:rPr>
+    </w:lvl>
+    <w:lvl w:ilvl="4" w:tentative="1">
+      <w:start w:val="1"/>
+      <w:numFmt w:val="bullet"/>
+      <w:lvlText w:val=""/>
+      <w:lvlJc w:val="left"/>
+      <w:pPr>
+        <w:tabs>
+          <w:tab w:val="num" w:pos="3600"/>
+        </w:tabs>
+        <w:ind w:left="3600" w:hanging="360"/>
+      </w:pPr>
+      <w:rPr>
+        <w:rFonts w:ascii="Wingdings" w:hAnsi="Wingdings" w:hint="default"/>
+        <w:sz w:val="20"/>
+      </w:rPr>
+    </w:lvl>
+    <w:lvl w:ilvl="5" w:tentative="1">
+      <w:start w:val="1"/>
+      <w:numFmt w:val="bullet"/>
+      <w:lvlText w:val=""/>
+      <w:lvlJc w:val="left"/>
+      <w:pPr>
+        <w:tabs>
+          <w:tab w:val="num" w:pos="4320"/>
+        </w:tabs>
+        <w:ind w:left="4320" w:hanging="360"/>
+      </w:pPr>
+      <w:rPr>
+        <w:rFonts w:ascii="Wingdings" w:hAnsi="Wingdings" w:hint="default"/>
+        <w:sz w:val="20"/>
+      </w:rPr>
+    </w:lvl>
+    <w:lvl w:ilvl="6" w:tentative="1">
+      <w:start w:val="1"/>
+      <w:numFmt w:val="bullet"/>
+      <w:lvlText w:val=""/>
+      <w:lvlJc w:val="left"/>
+      <w:pPr>
+        <w:tabs>
+          <w:tab w:val="num" w:pos="5040"/>
+        </w:tabs>
+        <w:ind w:left="5040" w:hanging="360"/>
+      </w:pPr>
+      <w:rPr>
+        <w:rFonts w:ascii="Wingdings" w:hAnsi="Wingdings" w:hint="default"/>
+        <w:sz w:val="20"/>
+      </w:rPr>
+    </w:lvl>
+    <w:lvl w:ilvl="7" w:tentative="1">
+      <w:start w:val="1"/>
+      <w:numFmt w:val="bullet"/>
+      <w:lvlText w:val=""/>
+      <w:lvlJc w:val="left"/>
+      <w:pPr>
+        <w:tabs>
+          <w:tab w:val="num" w:pos="5760"/>
+        </w:tabs>
+        <w:ind w:left="5760" w:hanging="360"/>
+      </w:pPr>
+      <w:rPr>
+        <w:rFonts w:ascii="Wingdings" w:hAnsi="Wingdings" w:hint="default"/>
+        <w:sz w:val="20"/>
+      </w:rPr>
+    </w:lvl>
+    <w:lvl w:ilvl="8" w:tentative="1">
+      <w:start w:val="1"/>
+      <w:numFmt w:val="bullet"/>
+      <w:lvlText w:val=""/>
+      <w:lvlJc w:val="left"/>
+      <w:pPr>
+        <w:tabs>
+          <w:tab w:val="num" w:pos="6480"/>
+        </w:tabs>
+        <w:ind w:left="6480" w:hanging="360"/>
+      </w:pPr>
+      <w:rPr>
+        <w:rFonts w:ascii="Wingdings" w:hAnsi="Wingdings" w:hint="default"/>
+        <w:sz w:val="20"/>
+      </w:rPr>
+    </w:lvl>
+  </w:abstractNum>
+  <w:abstractNum w:abstractNumId="35" w15:restartNumberingAfterBreak="0">
+    <w:nsid w:val="782274D0"/>
+    <w:multiLevelType w:val="multilevel"/>
+    <w:tmpl w:val="1E14678C"/>
+    <w:lvl w:ilvl="0">
+      <w:start w:val="1"/>
+      <w:numFmt w:val="bullet"/>
+      <w:lvlText w:val=""/>
+      <w:lvlJc w:val="left"/>
+      <w:pPr>
+        <w:tabs>
+          <w:tab w:val="num" w:pos="720"/>
+        </w:tabs>
+        <w:ind w:left="720" w:hanging="360"/>
+      </w:pPr>
+      <w:rPr>
+        <w:rFonts w:ascii="Symbol" w:hAnsi="Symbol" w:hint="default"/>
+        <w:sz w:val="20"/>
+      </w:rPr>
+    </w:lvl>
+    <w:lvl w:ilvl="1" w:tentative="1">
+      <w:start w:val="1"/>
+      <w:numFmt w:val="bullet"/>
+      <w:lvlText w:val="o"/>
+      <w:lvlJc w:val="left"/>
+      <w:pPr>
+        <w:tabs>
+          <w:tab w:val="num" w:pos="1440"/>
+        </w:tabs>
+        <w:ind w:left="1440" w:hanging="360"/>
+      </w:pPr>
+      <w:rPr>
+        <w:rFonts w:ascii="Courier New" w:hAnsi="Courier New" w:hint="default"/>
+        <w:sz w:val="20"/>
+      </w:rPr>
+    </w:lvl>
+    <w:lvl w:ilvl="2" w:tentative="1">
+      <w:start w:val="1"/>
+      <w:numFmt w:val="bullet"/>
+      <w:lvlText w:val=""/>
+      <w:lvlJc w:val="left"/>
+      <w:pPr>
+        <w:tabs>
+          <w:tab w:val="num" w:pos="2160"/>
+        </w:tabs>
+        <w:ind w:left="2160" w:hanging="360"/>
+      </w:pPr>
+      <w:rPr>
+        <w:rFonts w:ascii="Wingdings" w:hAnsi="Wingdings" w:hint="default"/>
+        <w:sz w:val="20"/>
+      </w:rPr>
+    </w:lvl>
+    <w:lvl w:ilvl="3" w:tentative="1">
+      <w:start w:val="1"/>
+      <w:numFmt w:val="bullet"/>
+      <w:lvlText w:val=""/>
+      <w:lvlJc w:val="left"/>
+      <w:pPr>
+        <w:tabs>
+          <w:tab w:val="num" w:pos="2880"/>
+        </w:tabs>
+        <w:ind w:left="2880" w:hanging="360"/>
+      </w:pPr>
+      <w:rPr>
+        <w:rFonts w:ascii="Wingdings" w:hAnsi="Wingdings" w:hint="default"/>
+        <w:sz w:val="20"/>
+      </w:rPr>
+    </w:lvl>
+    <w:lvl w:ilvl="4" w:tentative="1">
+      <w:start w:val="1"/>
+      <w:numFmt w:val="bullet"/>
+      <w:lvlText w:val=""/>
+      <w:lvlJc w:val="left"/>
+      <w:pPr>
+        <w:tabs>
+          <w:tab w:val="num" w:pos="3600"/>
+        </w:tabs>
+        <w:ind w:left="3600" w:hanging="360"/>
+      </w:pPr>
+      <w:rPr>
+        <w:rFonts w:ascii="Wingdings" w:hAnsi="Wingdings" w:hint="default"/>
+        <w:sz w:val="20"/>
+      </w:rPr>
+    </w:lvl>
+    <w:lvl w:ilvl="5" w:tentative="1">
+      <w:start w:val="1"/>
+      <w:numFmt w:val="bullet"/>
+      <w:lvlText w:val=""/>
+      <w:lvlJc w:val="left"/>
+      <w:pPr>
+        <w:tabs>
+          <w:tab w:val="num" w:pos="4320"/>
+        </w:tabs>
+        <w:ind w:left="4320" w:hanging="360"/>
+      </w:pPr>
+      <w:rPr>
+        <w:rFonts w:ascii="Wingdings" w:hAnsi="Wingdings" w:hint="default"/>
+        <w:sz w:val="20"/>
+      </w:rPr>
+    </w:lvl>
+    <w:lvl w:ilvl="6" w:tentative="1">
+      <w:start w:val="1"/>
+      <w:numFmt w:val="bullet"/>
+      <w:lvlText w:val=""/>
+      <w:lvlJc w:val="left"/>
+      <w:pPr>
+        <w:tabs>
+          <w:tab w:val="num" w:pos="5040"/>
+        </w:tabs>
+        <w:ind w:left="5040" w:hanging="360"/>
+      </w:pPr>
+      <w:rPr>
+        <w:rFonts w:ascii="Wingdings" w:hAnsi="Wingdings" w:hint="default"/>
+        <w:sz w:val="20"/>
+      </w:rPr>
+    </w:lvl>
+    <w:lvl w:ilvl="7" w:tentative="1">
+      <w:start w:val="1"/>
+      <w:numFmt w:val="bullet"/>
+      <w:lvlText w:val=""/>
+      <w:lvlJc w:val="left"/>
+      <w:pPr>
+        <w:tabs>
+          <w:tab w:val="num" w:pos="5760"/>
+        </w:tabs>
+        <w:ind w:left="5760" w:hanging="360"/>
+      </w:pPr>
+      <w:rPr>
+        <w:rFonts w:ascii="Wingdings" w:hAnsi="Wingdings" w:hint="default"/>
+        <w:sz w:val="20"/>
+      </w:rPr>
+    </w:lvl>
+    <w:lvl w:ilvl="8" w:tentative="1">
+      <w:start w:val="1"/>
+      <w:numFmt w:val="bullet"/>
+      <w:lvlText w:val=""/>
+      <w:lvlJc w:val="left"/>
+      <w:pPr>
+        <w:tabs>
+          <w:tab w:val="num" w:pos="6480"/>
+        </w:tabs>
+        <w:ind w:left="6480" w:hanging="360"/>
+      </w:pPr>
+      <w:rPr>
+        <w:rFonts w:ascii="Wingdings" w:hAnsi="Wingdings" w:hint="default"/>
+        <w:sz w:val="20"/>
+      </w:rPr>
+    </w:lvl>
+  </w:abstractNum>
+  <w:abstractNum w:abstractNumId="36" w15:restartNumberingAfterBreak="0">
     <w:nsid w:val="78BB6BC5"/>
     <w:multiLevelType w:val="multilevel"/>
     <w:tmpl w:val="53D6ABD2"/>
@@ -5062,7 +9167,7 @@
       </w:rPr>
     </w:lvl>
   </w:abstractNum>
-  <w:abstractNum w:abstractNumId="19" w15:restartNumberingAfterBreak="0">
+  <w:abstractNum w:abstractNumId="37" w15:restartNumberingAfterBreak="0">
     <w:nsid w:val="7F3A2118"/>
     <w:multiLevelType w:val="multilevel"/>
     <w:tmpl w:val="77DCD87A"/>
@@ -5211,65 +9316,271 @@
       </w:rPr>
     </w:lvl>
   </w:abstractNum>
+  <w:abstractNum w:abstractNumId="38" w15:restartNumberingAfterBreak="0">
+    <w:nsid w:val="7F4F3FAE"/>
+    <w:multiLevelType w:val="multilevel"/>
+    <w:tmpl w:val="4D96E94E"/>
+    <w:lvl w:ilvl="0">
+      <w:start w:val="1"/>
+      <w:numFmt w:val="bullet"/>
+      <w:lvlText w:val=""/>
+      <w:lvlJc w:val="left"/>
+      <w:pPr>
+        <w:tabs>
+          <w:tab w:val="num" w:pos="720"/>
+        </w:tabs>
+        <w:ind w:left="720" w:hanging="360"/>
+      </w:pPr>
+      <w:rPr>
+        <w:rFonts w:ascii="Symbol" w:hAnsi="Symbol" w:hint="default"/>
+        <w:sz w:val="20"/>
+      </w:rPr>
+    </w:lvl>
+    <w:lvl w:ilvl="1" w:tentative="1">
+      <w:start w:val="1"/>
+      <w:numFmt w:val="bullet"/>
+      <w:lvlText w:val="o"/>
+      <w:lvlJc w:val="left"/>
+      <w:pPr>
+        <w:tabs>
+          <w:tab w:val="num" w:pos="1440"/>
+        </w:tabs>
+        <w:ind w:left="1440" w:hanging="360"/>
+      </w:pPr>
+      <w:rPr>
+        <w:rFonts w:ascii="Courier New" w:hAnsi="Courier New" w:hint="default"/>
+        <w:sz w:val="20"/>
+      </w:rPr>
+    </w:lvl>
+    <w:lvl w:ilvl="2" w:tentative="1">
+      <w:start w:val="1"/>
+      <w:numFmt w:val="bullet"/>
+      <w:lvlText w:val=""/>
+      <w:lvlJc w:val="left"/>
+      <w:pPr>
+        <w:tabs>
+          <w:tab w:val="num" w:pos="2160"/>
+        </w:tabs>
+        <w:ind w:left="2160" w:hanging="360"/>
+      </w:pPr>
+      <w:rPr>
+        <w:rFonts w:ascii="Wingdings" w:hAnsi="Wingdings" w:hint="default"/>
+        <w:sz w:val="20"/>
+      </w:rPr>
+    </w:lvl>
+    <w:lvl w:ilvl="3" w:tentative="1">
+      <w:start w:val="1"/>
+      <w:numFmt w:val="bullet"/>
+      <w:lvlText w:val=""/>
+      <w:lvlJc w:val="left"/>
+      <w:pPr>
+        <w:tabs>
+          <w:tab w:val="num" w:pos="2880"/>
+        </w:tabs>
+        <w:ind w:left="2880" w:hanging="360"/>
+      </w:pPr>
+      <w:rPr>
+        <w:rFonts w:ascii="Wingdings" w:hAnsi="Wingdings" w:hint="default"/>
+        <w:sz w:val="20"/>
+      </w:rPr>
+    </w:lvl>
+    <w:lvl w:ilvl="4" w:tentative="1">
+      <w:start w:val="1"/>
+      <w:numFmt w:val="bullet"/>
+      <w:lvlText w:val=""/>
+      <w:lvlJc w:val="left"/>
+      <w:pPr>
+        <w:tabs>
+          <w:tab w:val="num" w:pos="3600"/>
+        </w:tabs>
+        <w:ind w:left="3600" w:hanging="360"/>
+      </w:pPr>
+      <w:rPr>
+        <w:rFonts w:ascii="Wingdings" w:hAnsi="Wingdings" w:hint="default"/>
+        <w:sz w:val="20"/>
+      </w:rPr>
+    </w:lvl>
+    <w:lvl w:ilvl="5" w:tentative="1">
+      <w:start w:val="1"/>
+      <w:numFmt w:val="bullet"/>
+      <w:lvlText w:val=""/>
+      <w:lvlJc w:val="left"/>
+      <w:pPr>
+        <w:tabs>
+          <w:tab w:val="num" w:pos="4320"/>
+        </w:tabs>
+        <w:ind w:left="4320" w:hanging="360"/>
+      </w:pPr>
+      <w:rPr>
+        <w:rFonts w:ascii="Wingdings" w:hAnsi="Wingdings" w:hint="default"/>
+        <w:sz w:val="20"/>
+      </w:rPr>
+    </w:lvl>
+    <w:lvl w:ilvl="6" w:tentative="1">
+      <w:start w:val="1"/>
+      <w:numFmt w:val="bullet"/>
+      <w:lvlText w:val=""/>
+      <w:lvlJc w:val="left"/>
+      <w:pPr>
+        <w:tabs>
+          <w:tab w:val="num" w:pos="5040"/>
+        </w:tabs>
+        <w:ind w:left="5040" w:hanging="360"/>
+      </w:pPr>
+      <w:rPr>
+        <w:rFonts w:ascii="Wingdings" w:hAnsi="Wingdings" w:hint="default"/>
+        <w:sz w:val="20"/>
+      </w:rPr>
+    </w:lvl>
+    <w:lvl w:ilvl="7" w:tentative="1">
+      <w:start w:val="1"/>
+      <w:numFmt w:val="bullet"/>
+      <w:lvlText w:val=""/>
+      <w:lvlJc w:val="left"/>
+      <w:pPr>
+        <w:tabs>
+          <w:tab w:val="num" w:pos="5760"/>
+        </w:tabs>
+        <w:ind w:left="5760" w:hanging="360"/>
+      </w:pPr>
+      <w:rPr>
+        <w:rFonts w:ascii="Wingdings" w:hAnsi="Wingdings" w:hint="default"/>
+        <w:sz w:val="20"/>
+      </w:rPr>
+    </w:lvl>
+    <w:lvl w:ilvl="8" w:tentative="1">
+      <w:start w:val="1"/>
+      <w:numFmt w:val="bullet"/>
+      <w:lvlText w:val=""/>
+      <w:lvlJc w:val="left"/>
+      <w:pPr>
+        <w:tabs>
+          <w:tab w:val="num" w:pos="6480"/>
+        </w:tabs>
+        <w:ind w:left="6480" w:hanging="360"/>
+      </w:pPr>
+      <w:rPr>
+        <w:rFonts w:ascii="Wingdings" w:hAnsi="Wingdings" w:hint="default"/>
+        <w:sz w:val="20"/>
+      </w:rPr>
+    </w:lvl>
+  </w:abstractNum>
   <w:num w:numId="1" w16cid:durableId="844368367">
-    <w:abstractNumId w:val="19"/>
+    <w:abstractNumId w:val="37"/>
   </w:num>
   <w:num w:numId="2" w16cid:durableId="954869341">
+    <w:abstractNumId w:val="23"/>
+  </w:num>
+  <w:num w:numId="3" w16cid:durableId="1025591606">
+    <w:abstractNumId w:val="32"/>
+  </w:num>
+  <w:num w:numId="4" w16cid:durableId="375860568">
+    <w:abstractNumId w:val="31"/>
+  </w:num>
+  <w:num w:numId="5" w16cid:durableId="279917594">
+    <w:abstractNumId w:val="15"/>
+  </w:num>
+  <w:num w:numId="6" w16cid:durableId="1023097287">
+    <w:abstractNumId w:val="13"/>
+  </w:num>
+  <w:num w:numId="7" w16cid:durableId="81727564">
+    <w:abstractNumId w:val="16"/>
+  </w:num>
+  <w:num w:numId="8" w16cid:durableId="594482609">
+    <w:abstractNumId w:val="33"/>
+  </w:num>
+  <w:num w:numId="9" w16cid:durableId="1343702532">
+    <w:abstractNumId w:val="20"/>
+  </w:num>
+  <w:num w:numId="10" w16cid:durableId="393429403">
+    <w:abstractNumId w:val="17"/>
+  </w:num>
+  <w:num w:numId="11" w16cid:durableId="225648763">
+    <w:abstractNumId w:val="7"/>
+  </w:num>
+  <w:num w:numId="12" w16cid:durableId="310410592">
+    <w:abstractNumId w:val="12"/>
+  </w:num>
+  <w:num w:numId="13" w16cid:durableId="1089542340">
+    <w:abstractNumId w:val="8"/>
+  </w:num>
+  <w:num w:numId="14" w16cid:durableId="1266841767">
+    <w:abstractNumId w:val="28"/>
+  </w:num>
+  <w:num w:numId="15" w16cid:durableId="1555463757">
+    <w:abstractNumId w:val="29"/>
+  </w:num>
+  <w:num w:numId="16" w16cid:durableId="2090424363">
+    <w:abstractNumId w:val="11"/>
+  </w:num>
+  <w:num w:numId="17" w16cid:durableId="830221000">
+    <w:abstractNumId w:val="9"/>
+  </w:num>
+  <w:num w:numId="18" w16cid:durableId="1355499039">
+    <w:abstractNumId w:val="30"/>
+  </w:num>
+  <w:num w:numId="19" w16cid:durableId="1341270998">
+    <w:abstractNumId w:val="27"/>
+  </w:num>
+  <w:num w:numId="20" w16cid:durableId="18286694">
+    <w:abstractNumId w:val="36"/>
+  </w:num>
+  <w:num w:numId="21" w16cid:durableId="130486689">
+    <w:abstractNumId w:val="4"/>
+  </w:num>
+  <w:num w:numId="22" w16cid:durableId="570652264">
+    <w:abstractNumId w:val="5"/>
+  </w:num>
+  <w:num w:numId="23" w16cid:durableId="1580361690">
+    <w:abstractNumId w:val="14"/>
+  </w:num>
+  <w:num w:numId="24" w16cid:durableId="697893803">
+    <w:abstractNumId w:val="24"/>
+  </w:num>
+  <w:num w:numId="25" w16cid:durableId="1618023111">
+    <w:abstractNumId w:val="22"/>
+  </w:num>
+  <w:num w:numId="26" w16cid:durableId="341049710">
+    <w:abstractNumId w:val="3"/>
+  </w:num>
+  <w:num w:numId="27" w16cid:durableId="1625580172">
+    <w:abstractNumId w:val="35"/>
+  </w:num>
+  <w:num w:numId="28" w16cid:durableId="998655680">
+    <w:abstractNumId w:val="21"/>
+  </w:num>
+  <w:num w:numId="29" w16cid:durableId="311296542">
+    <w:abstractNumId w:val="1"/>
+  </w:num>
+  <w:num w:numId="30" w16cid:durableId="1774402542">
+    <w:abstractNumId w:val="26"/>
+  </w:num>
+  <w:num w:numId="31" w16cid:durableId="290209748">
+    <w:abstractNumId w:val="25"/>
+  </w:num>
+  <w:num w:numId="32" w16cid:durableId="554051359">
+    <w:abstractNumId w:val="34"/>
+  </w:num>
+  <w:num w:numId="33" w16cid:durableId="2130733794">
+    <w:abstractNumId w:val="38"/>
+  </w:num>
+  <w:num w:numId="34" w16cid:durableId="1794514959">
     <w:abstractNumId w:val="10"/>
   </w:num>
-  <w:num w:numId="3" w16cid:durableId="1025591606">
-    <w:abstractNumId w:val="16"/>
+  <w:num w:numId="35" w16cid:durableId="776559543">
+    <w:abstractNumId w:val="2"/>
   </w:num>
-  <w:num w:numId="4" w16cid:durableId="375860568">
-    <w:abstractNumId w:val="15"/>
+  <w:num w:numId="36" w16cid:durableId="1363358223">
+    <w:abstractNumId w:val="18"/>
   </w:num>
-  <w:num w:numId="5" w16cid:durableId="279917594">
+  <w:num w:numId="37" w16cid:durableId="1341354781">
     <w:abstractNumId w:val="6"/>
   </w:num>
-  <w:num w:numId="6" w16cid:durableId="1023097287">
-    <w:abstractNumId w:val="5"/>
-  </w:num>
-  <w:num w:numId="7" w16cid:durableId="81727564">
-    <w:abstractNumId w:val="7"/>
-  </w:num>
-  <w:num w:numId="8" w16cid:durableId="594482609">
-    <w:abstractNumId w:val="17"/>
-  </w:num>
-  <w:num w:numId="9" w16cid:durableId="1343702532">
-    <w:abstractNumId w:val="9"/>
-  </w:num>
-  <w:num w:numId="10" w16cid:durableId="393429403">
-    <w:abstractNumId w:val="8"/>
-  </w:num>
-  <w:num w:numId="11" w16cid:durableId="225648763">
+  <w:num w:numId="38" w16cid:durableId="1476676968">
     <w:abstractNumId w:val="0"/>
   </w:num>
-  <w:num w:numId="12" w16cid:durableId="310410592">
-    <w:abstractNumId w:val="4"/>
-  </w:num>
-  <w:num w:numId="13" w16cid:durableId="1089542340">
-    <w:abstractNumId w:val="1"/>
-  </w:num>
-  <w:num w:numId="14" w16cid:durableId="1266841767">
-    <w:abstractNumId w:val="12"/>
-  </w:num>
-  <w:num w:numId="15" w16cid:durableId="1555463757">
-    <w:abstractNumId w:val="13"/>
-  </w:num>
-  <w:num w:numId="16" w16cid:durableId="2090424363">
-    <w:abstractNumId w:val="3"/>
-  </w:num>
-  <w:num w:numId="17" w16cid:durableId="830221000">
-    <w:abstractNumId w:val="2"/>
-  </w:num>
-  <w:num w:numId="18" w16cid:durableId="1355499039">
-    <w:abstractNumId w:val="14"/>
-  </w:num>
-  <w:num w:numId="19" w16cid:durableId="1341270998">
-    <w:abstractNumId w:val="11"/>
-  </w:num>
-  <w:num w:numId="20" w16cid:durableId="18286694">
-    <w:abstractNumId w:val="18"/>
+  <w:num w:numId="39" w16cid:durableId="634525186">
+    <w:abstractNumId w:val="19"/>
   </w:num>
 </w:numbering>
 </file>

</xml_diff>